<commit_message>
Ajout d'un objet général pour la création du VM (ex : OPNsense)
</commit_message>
<xml_diff>
--- a/docs/Documentation_Tech_Kiformatou.docx
+++ b/docs/Documentation_Tech_Kiformatou.docx
@@ -115,7 +115,7 @@
                   <a:graphicData uri="http://schemas.openxmlformats.org/drawingml/2006/picture">
                     <pic:pic>
                       <pic:nvPicPr>
-                        <pic:cNvPr id="0" name="image3.png" descr="Emplacement pour une illustration ou une capture de votre choix"/>
+                        <pic:cNvPr id="0" name="image6.png" descr="Emplacement pour une illustration ou une capture de votre choix"/>
                         <pic:cNvPicPr>
                           <a:picLocks noChangeAspect="1" noChangeArrowheads="1"/>
                         </pic:cNvPicPr>
@@ -274,7 +274,7 @@
           </w:r>
           <w:hyperlink w:anchor="_Toc000000001" w:history="1">
             <w:r>
-              <w:t xml:space="preserve">1. Présentation du projet</w:t>
+              <w:t xml:space="preserve">Présentation du projet</w:t>
               <w:tab/>
               <w:t xml:space="preserve">4</w:t>
             </w:r>
@@ -287,9 +287,9 @@
               <w:tab w:val="right" w:leader="dot" w:pos="9514"/>
             </w:tabs>
           </w:pPr>
-          <w:hyperlink w:anchor="_Toc000000005" w:history="1">
+          <w:hyperlink w:anchor="_Toc000000034" w:history="1">
             <w:r>
-              <w:t xml:space="preserve">2.  Architecture</w:t>
+              <w:t xml:space="preserve">Architecture</w:t>
               <w:tab/>
               <w:t xml:space="preserve">4</w:t>
             </w:r>
@@ -302,9 +302,9 @@
               <w:tab w:val="right" w:leader="dot" w:pos="9514"/>
             </w:tabs>
           </w:pPr>
-          <w:hyperlink w:anchor="_Toc000000009" w:history="1">
+          <w:hyperlink w:anchor="_Toc000000035" w:history="1">
             <w:r>
-              <w:t xml:space="preserve">3.  Préparation de Hyper-V</w:t>
+              <w:t xml:space="preserve">Préparation de Hyper-V</w:t>
               <w:tab/>
               <w:t xml:space="preserve">5</w:t>
             </w:r>
@@ -319,7 +319,7 @@
           </w:pPr>
           <w:hyperlink w:anchor="_Toc000000025" w:history="1">
             <w:r>
-              <w:t xml:space="preserve">3.1. Activer Hyper-V</w:t>
+              <w:t xml:space="preserve">1. Activer Hyper-V</w:t>
               <w:tab/>
               <w:t xml:space="preserve">5</w:t>
             </w:r>
@@ -332,24 +332,9 @@
               <w:tab w:val="right" w:leader="dot" w:pos="9514"/>
             </w:tabs>
           </w:pPr>
-          <w:hyperlink w:anchor="_Toc000000026" w:history="1">
+          <w:hyperlink w:anchor="_Toc000000036" w:history="1">
             <w:r>
-              <w:t xml:space="preserve">3.2. Vérifier l’activation</w:t>
-              <w:tab/>
-              <w:t xml:space="preserve">5</w:t>
-            </w:r>
-          </w:hyperlink>
-        </w:p>
-        <w:p>
-          <w:pPr>
-            <w:pStyle w:val="TOC2"/>
-            <w:tabs>
-              <w:tab w:val="right" w:leader="dot" w:pos="9514"/>
-            </w:tabs>
-          </w:pPr>
-          <w:hyperlink w:anchor="_Toc000000027" w:history="1">
-            <w:r>
-              <w:t xml:space="preserve">3.3. Créer les vNICS</w:t>
+              <w:t xml:space="preserve">3. Créer les vNICS</w:t>
               <w:tab/>
               <w:t xml:space="preserve">5</w:t>
             </w:r>
@@ -362,11 +347,11 @@
               <w:tab w:val="right" w:leader="dot" w:pos="9514"/>
             </w:tabs>
           </w:pPr>
-          <w:hyperlink w:anchor="_Toc000000013" w:history="1">
+          <w:hyperlink w:anchor="_Toc000000037" w:history="1">
             <w:r>
-              <w:t xml:space="preserve">X. Utilisation</w:t>
+              <w:t xml:space="preserve">Création de la VM OPNsense</w:t>
               <w:tab/>
-              <w:t xml:space="preserve">5</w:t>
+              <w:t xml:space="preserve">7</w:t>
             </w:r>
           </w:hyperlink>
         </w:p>
@@ -377,11 +362,11 @@
               <w:tab w:val="right" w:leader="dot" w:pos="9514"/>
             </w:tabs>
           </w:pPr>
-          <w:hyperlink w:anchor="_Toc000000028" w:history="1">
+          <w:hyperlink w:anchor="_Toc000000038" w:history="1">
             <w:r>
-              <w:t xml:space="preserve">X.1. Créer une VM</w:t>
+              <w:t xml:space="preserve">1. Créer la VM OPNsense</w:t>
               <w:tab/>
-              <w:t xml:space="preserve">5</w:t>
+              <w:t xml:space="preserve">7</w:t>
             </w:r>
           </w:hyperlink>
         </w:p>
@@ -394,9 +379,9 @@
           </w:pPr>
           <w:hyperlink w:anchor="_Toc000000029" w:history="1">
             <w:r>
-              <w:t xml:space="preserve">X.2. Créer un vSwitch</w:t>
+              <w:t xml:space="preserve">2. Créer un vSwitch</w:t>
               <w:tab/>
-              <w:t xml:space="preserve">5</w:t>
+              <w:t xml:space="preserve">8</w:t>
             </w:r>
           </w:hyperlink>
         </w:p>
@@ -409,9 +394,9 @@
           </w:pPr>
           <w:hyperlink w:anchor="_Toc000000030" w:history="1">
             <w:r>
-              <w:t xml:space="preserve">X.3. Exporter une VM vers un hôte Hyper-V</w:t>
+              <w:t xml:space="preserve">3. Exporter une VM vers un hôte Hyper-V</w:t>
               <w:tab/>
-              <w:t xml:space="preserve">5</w:t>
+              <w:t xml:space="preserve">8</w:t>
             </w:r>
           </w:hyperlink>
         </w:p>
@@ -426,7 +411,7 @@
             <w:r>
               <w:t xml:space="preserve">6.  Support et références</w:t>
               <w:tab/>
-              <w:t xml:space="preserve">6</w:t>
+              <w:t xml:space="preserve">9</w:t>
             </w:r>
           </w:hyperlink>
         </w:p>
@@ -441,7 +426,7 @@
             <w:r>
               <w:t xml:space="preserve">6.1. Diagnostic et support</w:t>
               <w:tab/>
-              <w:t xml:space="preserve">6</w:t>
+              <w:t xml:space="preserve">9</w:t>
             </w:r>
           </w:hyperlink>
         </w:p>
@@ -456,7 +441,7 @@
             <w:r>
               <w:t xml:space="preserve">6.2. Glossaire</w:t>
               <w:tab/>
-              <w:t xml:space="preserve">6</w:t>
+              <w:t xml:space="preserve">9</w:t>
             </w:r>
           </w:hyperlink>
         </w:p>
@@ -471,7 +456,7 @@
             <w:r>
               <w:t xml:space="preserve">6.3. Références</w:t>
               <w:tab/>
-              <w:t xml:space="preserve">6</w:t>
+              <w:t xml:space="preserve">9</w:t>
             </w:r>
           </w:hyperlink>
           <w:r>
@@ -498,7 +483,7 @@
       <w:bookmarkStart w:id="0" w:name="_Toc000000001"/>
       <w:bookmarkStart w:id="1" w:name="azure_section_1"/>
       <w:r>
-        <w:t xml:space="preserve">1. Présentation du projet</w:t>
+        <w:t xml:space="preserve">Présentation du projet</w:t>
       </w:r>
       <w:bookmarkEnd w:id="1"/>
       <w:bookmarkEnd w:id="0"/>
@@ -524,12 +509,10 @@
         <w:pStyle w:val="Heading1"/>
         <w:spacing w:before="0"/>
       </w:pPr>
-      <w:bookmarkStart w:id="2" w:name="_Toc000000005"/>
-      <w:bookmarkStart w:id="3" w:name="azure_section_5"/>
+      <w:bookmarkStart w:id="2" w:name="_Toc000000034"/>
       <w:r>
-        <w:t xml:space="preserve">2.  Architecture</w:t>
+        <w:t xml:space="preserve">Architecture</w:t>
       </w:r>
-      <w:bookmarkEnd w:id="3"/>
       <w:bookmarkEnd w:id="2"/>
     </w:p>
     <w:p>
@@ -608,48 +591,47 @@
         <w:pStyle w:val="Heading1"/>
         <w:spacing w:before="0"/>
       </w:pPr>
-      <w:bookmarkStart w:id="4" w:name="_Toc000000009"/>
-      <w:bookmarkStart w:id="5" w:name="azure_section_9"/>
+      <w:bookmarkStart w:id="3" w:name="_Toc000000035"/>
       <w:r>
-        <w:t xml:space="preserve">3.  Préparation de Hyper-V</w:t>
+        <w:t xml:space="preserve">Préparation de Hyper-V</w:t>
       </w:r>
-      <w:bookmarkEnd w:id="5"/>
-      <w:bookmarkEnd w:id="4"/>
+      <w:bookmarkEnd w:id="3"/>
     </w:p>
     <w:p>
       <w:pPr>
-        <w:pStyle w:val="Heading2"/>
-      </w:pPr>
-      <w:bookmarkStart w:id="6" w:name="_Toc000000025"/>
+        <w:pStyle w:val="Normal"/>
+        <w:spacing w:before="0"/>
+      </w:pPr>
       <w:r>
-        <w:t xml:space="preserve">3.1. Activer Hyper-V</w:t>
+        <w:t xml:space="preserve">Nous allons utiliser Hyper-V, un hyperviseur de type 1 pour simuler l’infrastructure de Kiformatou. Nous allons l’installer et le configurer afin de s’assurer que les VM puissent communiquer entre eux.</w:t>
       </w:r>
-      <w:bookmarkEnd w:id="6"/>
     </w:p>
     <w:p>
       <w:pPr>
-        <w:pStyle w:val="Heading2"/>
-      </w:pPr>
-      <w:bookmarkStart w:id="7" w:name="_Toc000000026"/>
-      <w:r>
-        <w:t xml:space="preserve">3.2. Vérifier l’activation</w:t>
-      </w:r>
-      <w:bookmarkEnd w:id="7"/>
+        <w:pStyle w:val="Normal"/>
+        <w:spacing w:before="0"/>
+      </w:pPr>
     </w:p>
     <w:p>
       <w:pPr>
         <w:pStyle w:val="Heading2"/>
       </w:pPr>
-      <w:bookmarkStart w:id="8" w:name="_Toc000000027"/>
+      <w:bookmarkStart w:id="4" w:name="_Toc000000025"/>
       <w:r>
-        <w:t xml:space="preserve">3.3. Créer les vNICS</w:t>
+        <w:t xml:space="preserve">1. Activer Hyper-V</w:t>
       </w:r>
-      <w:bookmarkEnd w:id="8"/>
+    </w:p>
+    <w:p>
+      <w:pPr>
+        <w:pStyle w:val="Normal"/>
+      </w:pPr>
+      <w:r>
+        <w:t xml:space="preserve">Sur Windows 10/11 Pro ou Entreprise, ouvrez PowerShell en administrateur, puis exécutez cette commande pour activer l’ensemble Hyper-V, y compris les outils de gestion et le module PowerShell :</w:t>
+      </w:r>
     </w:p>
     <w:tbl>
       <w:tblPr>
         <w:tblStyle w:val="TableGrid"/>
-        <w:tblpPr w:leftFromText="180" w:rightFromText="180" w:topFromText="0" w:bottomFromText="0" w:vertAnchor="text" w:horzAnchor="text" w:tblpX="261" w:tblpY="87"/>
         <w:tblW w:w="0" w:type="auto"/>
         <w:tblBorders>
           <w:top w:val="nil" w:sz="0" w:space="0" w:color="auto"/>
@@ -665,25 +647,51 @@
         <w:gridCol w:w="9524"/>
       </w:tblGrid>
       <w:tr>
-        <w:trPr>
-          <w:trHeight w:val="460" w:hRule="atLeast"/>
-        </w:trPr>
         <w:tc>
           <w:tcPr>
             <w:tcW w:w="9524" w:type="dxa"/>
-            <w:shd w:val="clear" w:color="auto" w:fill="CCCCCC"/>
+            <w:shd w:val="clear" w:color="auto" w:fill="000000"/>
           </w:tcPr>
           <w:p>
-            <w:pPr>
-              <w:rPr>
-                <w:noProof/>
-              </w:rPr>
-            </w:pPr>
             <w:r>
               <w:rPr>
-                <w:noProof/>
+                <w:rFonts w:ascii="Courier New" w:hAnsi="Courier New"/>
+                <w:color w:val="D4D4D4"/>
+                <w:sz w:val="21"/>
               </w:rPr>
-              <w:t xml:space="preserve">Get-VMSwitch</w:t>
+              <w:t xml:space="preserve">Enable-WindowsOptionalFeature -Online -FeatureName Microsoft-Hyper-V-</w:t>
+            </w:r>
+            <w:r>
+              <w:rPr>
+                <w:rFonts w:ascii="Courier New" w:hAnsi="Courier New"/>
+                <w:color w:val="9CDCFE"/>
+                <w:sz w:val="21"/>
+              </w:rPr>
+              <w:t xml:space="preserve">All</w:t>
+            </w:r>
+            <w:r>
+              <w:rPr>
+                <w:rFonts w:ascii="Courier New" w:hAnsi="Courier New"/>
+                <w:color w:val="D4D4D4"/>
+                <w:sz w:val="21"/>
+              </w:rPr>
+              <w:t xml:space="preserve"> -</w:t>
+            </w:r>
+            <w:r>
+              <w:rPr>
+                <w:rFonts w:ascii="Courier New" w:hAnsi="Courier New"/>
+                <w:color w:val="9CDCFE"/>
+                <w:sz w:val="21"/>
+              </w:rPr>
+              <w:t xml:space="preserve">All</w:t>
+            </w:r>
+            <w:r>
+              <w:rPr>
+                <w:rFonts w:ascii="Courier New" w:hAnsi="Courier New"/>
+                <w:color w:val="D4D4D4"/>
+                <w:sz w:val="21"/>
+              </w:rPr>
+              <w:t xml:space="preserve"> -NoRestart</w:t>
             </w:r>
           </w:p>
         </w:tc>
@@ -698,44 +706,1315 @@
       <w:pPr>
         <w:pStyle w:val="Normal"/>
       </w:pPr>
+      <w:r>
+        <w:t xml:space="preserve">Après l’installation, redémarrez :</w:t>
+      </w:r>
+    </w:p>
+    <w:tbl>
+      <w:tblPr>
+        <w:tblStyle w:val="TableGrid"/>
+        <w:tblW w:w="0" w:type="auto"/>
+        <w:tblBorders>
+          <w:top w:val="nil" w:sz="0" w:space="0" w:color="auto"/>
+          <w:left w:val="nil" w:sz="0" w:space="0" w:color="auto"/>
+          <w:bottom w:val="nil" w:sz="0" w:space="0" w:color="auto"/>
+          <w:right w:val="nil" w:sz="0" w:space="0" w:color="auto"/>
+          <w:insideH w:val="nil" w:sz="0" w:space="0" w:color="auto"/>
+          <w:insideV w:val="nil" w:sz="0" w:space="0" w:color="auto"/>
+        </w:tblBorders>
+        <w:tblLook w:val="04A0" w:firstRow="1" w:lastRow="0" w:firstColumn="1" w:lastColumn="0" w:noHBand="0" w:noVBand="1"/>
+      </w:tblPr>
+      <w:tblGrid>
+        <w:gridCol w:w="9524"/>
+      </w:tblGrid>
+      <w:tr>
+        <w:tc>
+          <w:tcPr>
+            <w:tcW w:w="9524" w:type="dxa"/>
+            <w:shd w:val="clear" w:color="auto" w:fill="000000"/>
+          </w:tcPr>
+          <w:p>
+            <w:r>
+              <w:rPr>
+                <w:rFonts w:ascii="Courier New" w:hAnsi="Courier New"/>
+                <w:color w:val="D4D4D4"/>
+                <w:sz w:val="21"/>
+              </w:rPr>
+              <w:t xml:space="preserve">Restart-Computer</w:t>
+            </w:r>
+          </w:p>
+        </w:tc>
+      </w:tr>
+    </w:tbl>
+    <w:p>
+      <w:pPr>
+        <w:pStyle w:val="Normal"/>
+      </w:pPr>
     </w:p>
     <w:p>
       <w:pPr>
         <w:pStyle w:val="Normal"/>
       </w:pPr>
+      <w:r>
+        <w:t xml:space="preserve">Après le redémarrage, vérifiez les composants :</w:t>
+      </w:r>
+    </w:p>
+    <w:tbl>
+      <w:tblPr>
+        <w:tblStyle w:val="TableGrid"/>
+        <w:tblW w:w="0" w:type="auto"/>
+        <w:tblLook w:val="04A0" w:firstRow="1" w:lastRow="0" w:firstColumn="1" w:lastColumn="0" w:noHBand="0" w:noVBand="1"/>
+      </w:tblPr>
+      <w:tblGrid>
+        <w:gridCol w:w="9524"/>
+      </w:tblGrid>
+      <w:tr>
+        <w:tc>
+          <w:tcPr>
+            <w:tcW w:w="9524" w:type="dxa"/>
+            <w:shd w:val="clear" w:color="auto" w:fill="000000"/>
+          </w:tcPr>
+          <w:p>
+            <w:pPr>
+              <w:rPr>
+                <w:rFonts w:ascii="Courier New" w:hAnsi="Courier New"/>
+                <w:color w:val="0000FF"/>
+                <w:sz w:val="21"/>
+              </w:rPr>
+            </w:pPr>
+            <w:r>
+              <w:rPr>
+                <w:rFonts w:ascii="Courier New" w:hAnsi="Courier New"/>
+                <w:color w:val="569CD6"/>
+                <w:sz w:val="21"/>
+              </w:rPr>
+              <w:t xml:space="preserve">Get</w:t>
+            </w:r>
+            <w:r>
+              <w:rPr>
+                <w:rFonts w:ascii="Courier New" w:hAnsi="Courier New"/>
+                <w:color w:val="D4D4D4"/>
+                <w:sz w:val="21"/>
+              </w:rPr>
+              <w:t xml:space="preserve">-WindowsOptionalFeature -Online |</w:t>
+            </w:r>
+          </w:p>
+          <w:p>
+            <w:r>
+              <w:rPr>
+                <w:rFonts w:ascii="Courier New" w:hAnsi="Courier New"/>
+                <w:color w:val="D4D4D4"/>
+                <w:sz w:val="21"/>
+              </w:rPr>
+              <w:t xml:space="preserve">    </w:t>
+            </w:r>
+            <w:r>
+              <w:rPr>
+                <w:rFonts w:ascii="Courier New" w:hAnsi="Courier New"/>
+                <w:color w:val="569CD6"/>
+                <w:sz w:val="21"/>
+              </w:rPr>
+              <w:t xml:space="preserve">Where</w:t>
+            </w:r>
+            <w:r>
+              <w:rPr>
+                <w:rFonts w:ascii="Courier New" w:hAnsi="Courier New"/>
+                <w:color w:val="D4D4D4"/>
+                <w:sz w:val="21"/>
+              </w:rPr>
+              <w:t xml:space="preserve">-Object FeatureName -</w:t>
+            </w:r>
+            <w:r>
+              <w:rPr>
+                <w:rFonts w:ascii="Courier New" w:hAnsi="Courier New"/>
+                <w:color w:val="569CD6"/>
+                <w:sz w:val="21"/>
+              </w:rPr>
+              <w:t xml:space="preserve">Like</w:t>
+            </w:r>
+            <w:r>
+              <w:rPr>
+                <w:rFonts w:ascii="Courier New" w:hAnsi="Courier New"/>
+                <w:color w:val="D4D4D4"/>
+                <w:sz w:val="21"/>
+              </w:rPr>
+              <w:t xml:space="preserve"> "*Hyper-V*" |</w:t>
+            </w:r>
+          </w:p>
+          <w:p>
+            <w:r>
+              <w:rPr>
+                <w:rFonts w:ascii="Courier New" w:hAnsi="Courier New"/>
+                <w:color w:val="D4D4D4"/>
+                <w:sz w:val="21"/>
+              </w:rPr>
+              <w:t xml:space="preserve">    Format-</w:t>
+            </w:r>
+            <w:r>
+              <w:rPr>
+                <w:rFonts w:ascii="Courier New" w:hAnsi="Courier New"/>
+                <w:color w:val="569CD6"/>
+                <w:sz w:val="21"/>
+              </w:rPr>
+              <w:t xml:space="preserve">Table</w:t>
+            </w:r>
+            <w:r>
+              <w:rPr>
+                <w:rFonts w:ascii="Courier New" w:hAnsi="Courier New"/>
+                <w:color w:val="D4D4D4"/>
+                <w:sz w:val="21"/>
+              </w:rPr>
+              <w:t xml:space="preserve"> FeatureName, State</w:t>
+            </w:r>
+          </w:p>
+        </w:tc>
+      </w:tr>
+    </w:tbl>
+    <w:p>
+      <w:pPr>
+        <w:pStyle w:val="Normal"/>
+      </w:pPr>
     </w:p>
     <w:p>
       <w:pPr>
         <w:pStyle w:val="Normal"/>
       </w:pPr>
+      <w:r>
+        <w:t xml:space="preserve">Assurez-vous d’avoir l’affichage suivant où toutes les fonctionalités sont à </w:t>
+      </w:r>
+      <w:r>
+        <w:rPr>
+          <w:b/>
+          <w:bCs/>
+        </w:rPr>
+        <w:t xml:space="preserve">Enabled</w:t>
+      </w:r>
+      <w:r>
+        <w:t xml:space="preserve">:</w:t>
+      </w:r>
+    </w:p>
+    <w:tbl>
+      <w:tblPr>
+        <w:tblStyle w:val="TableGrid"/>
+        <w:tblW w:w="0" w:type="auto"/>
+        <w:tblLook w:val="04A0" w:firstRow="1" w:lastRow="0" w:firstColumn="1" w:lastColumn="0" w:noHBand="0" w:noVBand="1"/>
+      </w:tblPr>
+      <w:tblGrid>
+        <w:gridCol w:w="9524"/>
+      </w:tblGrid>
+      <w:tr>
+        <w:tc>
+          <w:tcPr>
+            <w:tcW w:w="9524" w:type="dxa"/>
+            <w:shd w:val="clear" w:color="auto" w:fill="000000"/>
+          </w:tcPr>
+          <w:p>
+            <w:r>
+              <w:rPr>
+                <w:rFonts w:ascii="Courier New" w:hAnsi="Courier New"/>
+                <w:color w:val="D4D4D4"/>
+                <w:sz w:val="21"/>
+              </w:rPr>
+              <w:t xml:space="preserve">FeatureName                               State</w:t>
+            </w:r>
+          </w:p>
+          <w:p>
+            <w:r>
+              <w:rPr>
+                <w:rFonts w:ascii="Courier New" w:hAnsi="Courier New"/>
+                <w:i/>
+                <w:color w:val="6A9955"/>
+                <w:sz w:val="21"/>
+              </w:rPr>
+              <w:t xml:space="preserve">-----------                               -----</w:t>
+            </w:r>
+          </w:p>
+          <w:p>
+            <w:r>
+              <w:rPr>
+                <w:rFonts w:ascii="Courier New" w:hAnsi="Courier New"/>
+                <w:color w:val="D4D4D4"/>
+                <w:sz w:val="21"/>
+              </w:rPr>
+              <w:t xml:space="preserve">Microsoft-Hyper-V-</w:t>
+            </w:r>
+            <w:r>
+              <w:rPr>
+                <w:rFonts w:ascii="Courier New" w:hAnsi="Courier New"/>
+                <w:color w:val="569CD6"/>
+                <w:sz w:val="21"/>
+              </w:rPr>
+              <w:t xml:space="preserve">All</w:t>
+            </w:r>
+            <w:r>
+              <w:rPr>
+                <w:rFonts w:ascii="Courier New" w:hAnsi="Courier New"/>
+                <w:color w:val="D4D4D4"/>
+                <w:sz w:val="21"/>
+              </w:rPr>
+              <w:t xml:space="preserve">                   Enabled</w:t>
+            </w:r>
+          </w:p>
+          <w:p>
+            <w:r>
+              <w:rPr>
+                <w:rFonts w:ascii="Courier New" w:hAnsi="Courier New"/>
+                <w:color w:val="D4D4D4"/>
+                <w:sz w:val="21"/>
+              </w:rPr>
+              <w:t xml:space="preserve">Microsoft-Hyper-V                       Enabled</w:t>
+            </w:r>
+          </w:p>
+          <w:p>
+            <w:r>
+              <w:rPr>
+                <w:rFonts w:ascii="Courier New" w:hAnsi="Courier New"/>
+                <w:color w:val="D4D4D4"/>
+                <w:sz w:val="21"/>
+              </w:rPr>
+              <w:t xml:space="preserve">Microsoft-Hyper-V-Tools-</w:t>
+            </w:r>
+            <w:r>
+              <w:rPr>
+                <w:rFonts w:ascii="Courier New" w:hAnsi="Courier New"/>
+                <w:color w:val="569CD6"/>
+                <w:sz w:val="21"/>
+              </w:rPr>
+              <w:t xml:space="preserve">All</w:t>
+            </w:r>
+            <w:r>
+              <w:rPr>
+                <w:rFonts w:ascii="Courier New" w:hAnsi="Courier New"/>
+                <w:color w:val="D4D4D4"/>
+                <w:sz w:val="21"/>
+              </w:rPr>
+              <w:t xml:space="preserve">             Enabled</w:t>
+            </w:r>
+          </w:p>
+          <w:p>
+            <w:r>
+              <w:rPr>
+                <w:rFonts w:ascii="Courier New" w:hAnsi="Courier New"/>
+                <w:color w:val="D4D4D4"/>
+                <w:sz w:val="21"/>
+              </w:rPr>
+              <w:t xml:space="preserve">Microsoft-Hyper-V-Management-PowerShell Enabled</w:t>
+            </w:r>
+          </w:p>
+          <w:p>
+            <w:r>
+              <w:rPr>
+                <w:rFonts w:ascii="Courier New" w:hAnsi="Courier New"/>
+                <w:color w:val="D4D4D4"/>
+                <w:sz w:val="21"/>
+              </w:rPr>
+              <w:t xml:space="preserve">Microsoft-Hyper-V-Hypervisor            Enabled</w:t>
+            </w:r>
+          </w:p>
+          <w:p>
+            <w:r>
+              <w:rPr>
+                <w:rFonts w:ascii="Courier New" w:hAnsi="Courier New"/>
+                <w:color w:val="D4D4D4"/>
+                <w:sz w:val="21"/>
+              </w:rPr>
+              <w:t xml:space="preserve">Microsoft-Hyper-V-Services              Enabled</w:t>
+            </w:r>
+          </w:p>
+          <w:p>
+            <w:r>
+              <w:rPr>
+                <w:rFonts w:ascii="Courier New" w:hAnsi="Courier New"/>
+                <w:color w:val="D4D4D4"/>
+                <w:sz w:val="21"/>
+              </w:rPr>
+              <w:t xml:space="preserve">Microsoft-Hyper-V-Management-Clients    Enabled</w:t>
+            </w:r>
+          </w:p>
+        </w:tc>
+      </w:tr>
+    </w:tbl>
+    <w:p>
+      <w:pPr>
+        <w:pStyle w:val="Normal"/>
+      </w:pPr>
     </w:p>
     <w:p>
       <w:pPr>
-        <w:pStyle w:val="Heading1"/>
-      </w:pPr>
-      <w:bookmarkStart w:id="9" w:name="_Toc000000013"/>
-      <w:bookmarkStart w:id="10" w:name="azure_section_13"/>
-      <w:r>
-        <w:t xml:space="preserve">X. Utilisation</w:t>
-      </w:r>
-      <w:bookmarkEnd w:id="10"/>
-      <w:bookmarkEnd w:id="9"/>
+        <w:pStyle w:val="Normal"/>
+      </w:pPr>
     </w:p>
     <w:p>
       <w:pPr>
-        <w:pStyle w:val="Instruction"/>
-      </w:pPr>
+        <w:pStyle w:val="Heading2"/>
+      </w:pPr>
+      <w:bookmarkStart w:id="5" w:name="_Toc000000036"/>
+      <w:r>
+        <w:t xml:space="preserve">3. Créer les vNICS</w:t>
+      </w:r>
+      <w:bookmarkEnd w:id="5"/>
     </w:p>
     <w:p>
       <w:pPr>
+        <w:pStyle w:val="Normal"/>
+      </w:pPr>
+      <w:r>
+        <w:t xml:space="preserve">Nous voulons créer un switch interne pour le LAN Kiformatou et un switch externe pour l’accès Internet. Exécutez les commandes suivantes pour les créer :</w:t>
+      </w:r>
+    </w:p>
+    <w:p>
+      <w:pPr>
+        <w:pStyle w:val="Normal"/>
+      </w:pPr>
+    </w:p>
+    <w:p>
+      <w:pPr>
+        <w:pStyle w:val="Normal"/>
+      </w:pPr>
+    </w:p>
+    <w:p>
+      <w:pPr>
+        <w:pStyle w:val="Normal"/>
+      </w:pPr>
+      <w:r>
+        <w:t xml:space="preserve">S’il n’y a pas de doublons, exécutez ces commandes pour créer les vSwitches de l’infrastructure sur l’hôte :</w:t>
+      </w:r>
+    </w:p>
+    <w:tbl>
+      <w:tblPr>
+        <w:tblStyle w:val="TableGrid"/>
+        <w:tblW w:w="0" w:type="auto"/>
+        <w:tblLook w:val="04A0" w:firstRow="1" w:lastRow="0" w:firstColumn="1" w:lastColumn="0" w:noHBand="0" w:noVBand="1"/>
+      </w:tblPr>
+      <w:tblGrid>
+        <w:gridCol w:w="9524"/>
+      </w:tblGrid>
+      <w:tr>
+        <w:tc>
+          <w:tcPr>
+            <w:tcW w:w="9524" w:type="dxa"/>
+            <w:shd w:val="clear" w:color="auto" w:fill="000000"/>
+          </w:tcPr>
+          <w:p>
+            <w:pPr>
+              <w:rPr>
+                <w:rFonts w:ascii="Courier New" w:hAnsi="Courier New"/>
+                <w:color w:val="569CD6"/>
+                <w:sz w:val="21"/>
+              </w:rPr>
+            </w:pPr>
+            <w:r>
+              <w:rPr>
+                <w:rFonts w:ascii="Courier New" w:hAnsi="Courier New"/>
+                <w:color w:val="569CD6"/>
+                <w:sz w:val="21"/>
+              </w:rPr>
+              <w:t xml:space="preserve">New</w:t>
+            </w:r>
+            <w:r>
+              <w:rPr>
+                <w:rFonts w:ascii="Courier New" w:hAnsi="Courier New"/>
+                <w:color w:val="D4D4D4"/>
+                <w:sz w:val="21"/>
+              </w:rPr>
+              <w:t xml:space="preserve">-VMSwitch `</w:t>
+            </w:r>
+          </w:p>
+          <w:p>
+            <w:r>
+              <w:rPr>
+                <w:rFonts w:ascii="Courier New" w:hAnsi="Courier New"/>
+                <w:color w:val="D4D4D4"/>
+                <w:sz w:val="21"/>
+              </w:rPr>
+              <w:t xml:space="preserve">    -Name "KIFORMATOU" `</w:t>
+            </w:r>
+          </w:p>
+          <w:p>
+            <w:r>
+              <w:rPr>
+                <w:rFonts w:ascii="Courier New" w:hAnsi="Courier New"/>
+                <w:color w:val="D4D4D4"/>
+                <w:sz w:val="21"/>
+              </w:rPr>
+              <w:t xml:space="preserve">    -SwitchType Internal `</w:t>
+            </w:r>
+          </w:p>
+          <w:p/>
+          <w:p>
+            <w:r>
+              <w:rPr>
+                <w:rFonts w:ascii="Courier New" w:hAnsi="Courier New"/>
+                <w:color w:val="D4D4D4"/>
+                <w:sz w:val="21"/>
+              </w:rPr>
+              <w:t xml:space="preserve">Rename-VMSwitch -Name "KIFORMATOU" -NewName "KIFORMATOU"</w:t>
+            </w:r>
+          </w:p>
+          <w:p/>
+          <w:p>
+            <w:r>
+              <w:rPr>
+                <w:rFonts w:ascii="Courier New" w:hAnsi="Courier New"/>
+                <w:color w:val="569CD6"/>
+                <w:sz w:val="21"/>
+              </w:rPr>
+              <w:t xml:space="preserve">New</w:t>
+            </w:r>
+            <w:r>
+              <w:rPr>
+                <w:rFonts w:ascii="Courier New" w:hAnsi="Courier New"/>
+                <w:color w:val="D4D4D4"/>
+                <w:sz w:val="21"/>
+              </w:rPr>
+              <w:t xml:space="preserve">-VMSwitch `</w:t>
+            </w:r>
+          </w:p>
+          <w:p>
+            <w:r>
+              <w:rPr>
+                <w:rFonts w:ascii="Courier New" w:hAnsi="Courier New"/>
+                <w:color w:val="D4D4D4"/>
+                <w:sz w:val="21"/>
+              </w:rPr>
+              <w:t xml:space="preserve">    -Name "INTERNET" `</w:t>
+            </w:r>
+          </w:p>
+          <w:p>
+            <w:r>
+              <w:rPr>
+                <w:rFonts w:ascii="Courier New" w:hAnsi="Courier New"/>
+                <w:color w:val="D4D4D4"/>
+                <w:sz w:val="21"/>
+              </w:rPr>
+              <w:t xml:space="preserve">    -NetAdapterName "Ethernet" `</w:t>
+            </w:r>
+          </w:p>
+          <w:p>
+            <w:r>
+              <w:rPr>
+                <w:rFonts w:ascii="Courier New" w:hAnsi="Courier New"/>
+                <w:color w:val="D4D4D4"/>
+                <w:sz w:val="21"/>
+              </w:rPr>
+              <w:t xml:space="preserve">    -AllowManagementOS $</w:t>
+            </w:r>
+            <w:r>
+              <w:rPr>
+                <w:rFonts w:ascii="Courier New" w:hAnsi="Courier New"/>
+                <w:color w:val="569CD6"/>
+                <w:sz w:val="21"/>
+              </w:rPr>
+              <w:t xml:space="preserve">true</w:t>
+            </w:r>
+          </w:p>
+        </w:tc>
+      </w:tr>
+    </w:tbl>
+    <w:p>
+      <w:pPr>
+        <w:pStyle w:val="Normal"/>
+      </w:pPr>
+    </w:p>
+    <w:p>
+      <w:pPr>
+        <w:pStyle w:val="Normal"/>
+      </w:pPr>
+      <w:r>
+        <w:t xml:space="preserve">Vérifez ensuite :</w:t>
+      </w:r>
+    </w:p>
+    <w:tbl>
+      <w:tblPr>
+        <w:tblStyle w:val="TableGrid"/>
+        <w:tblW w:w="0" w:type="auto"/>
+        <w:tblLook w:val="04A0" w:firstRow="1" w:lastRow="0" w:firstColumn="1" w:lastColumn="0" w:noHBand="0" w:noVBand="1"/>
+      </w:tblPr>
+      <w:tblGrid>
+        <w:gridCol w:w="9524"/>
+      </w:tblGrid>
+      <w:tr>
+        <w:tc>
+          <w:tcPr>
+            <w:tcW w:w="9524" w:type="dxa"/>
+            <w:shd w:val="clear" w:color="auto" w:fill="000000"/>
+          </w:tcPr>
+          <w:p>
+            <w:r>
+              <w:rPr>
+                <w:rFonts w:ascii="Courier New" w:hAnsi="Courier New"/>
+                <w:color w:val="569CD6"/>
+                <w:sz w:val="21"/>
+              </w:rPr>
+              <w:t xml:space="preserve">Get</w:t>
+            </w:r>
+            <w:r>
+              <w:rPr>
+                <w:rFonts w:ascii="Courier New" w:hAnsi="Courier New"/>
+                <w:color w:val="D4D4D4"/>
+                <w:sz w:val="21"/>
+              </w:rPr>
+              <w:t xml:space="preserve">-VMSwitch</w:t>
+            </w:r>
+          </w:p>
+        </w:tc>
+      </w:tr>
+    </w:tbl>
+    <w:p>
+      <w:pPr>
+        <w:pStyle w:val="Normal"/>
+      </w:pPr>
+    </w:p>
+    <w:p>
+      <w:pPr>
+        <w:pStyle w:val="Normal"/>
+      </w:pPr>
+      <w:r>
+        <w:t xml:space="preserve">Vous devriez obtenir une affichage similaire : </w:t>
+      </w:r>
+    </w:p>
+    <w:tbl>
+      <w:tblPr>
+        <w:tblStyle w:val="TableGrid"/>
+        <w:tblW w:w="0" w:type="auto"/>
+        <w:tblLook w:val="04A0" w:firstRow="1" w:lastRow="0" w:firstColumn="1" w:lastColumn="0" w:noHBand="0" w:noVBand="1"/>
+      </w:tblPr>
+      <w:tblGrid>
+        <w:gridCol w:w="9524"/>
+      </w:tblGrid>
+      <w:tr>
+        <w:tc>
+          <w:tcPr>
+            <w:tcW w:w="9524" w:type="dxa"/>
+            <w:shd w:val="clear" w:color="auto" w:fill="000000"/>
+          </w:tcPr>
+          <w:p>
+            <w:r>
+              <w:rPr>
+                <w:rFonts w:ascii="Courier New" w:hAnsi="Courier New"/>
+                <w:color w:val="D4D4D4"/>
+                <w:sz w:val="21"/>
+              </w:rPr>
+              <w:t xml:space="preserve">Name           SwitchType NetAdapterInterfaceDescription</w:t>
+            </w:r>
+          </w:p>
+          <w:p>
+            <w:r>
+              <w:rPr>
+                <w:rFonts w:ascii="Courier New" w:hAnsi="Courier New"/>
+                <w:i/>
+                <w:color w:val="6A9955"/>
+                <w:sz w:val="21"/>
+              </w:rPr>
+              <w:t xml:space="preserve">----           ---------- ------------------------------</w:t>
+            </w:r>
+          </w:p>
+          <w:p>
+            <w:r>
+              <w:rPr>
+                <w:rFonts w:ascii="Courier New" w:hAnsi="Courier New"/>
+                <w:color w:val="569CD6"/>
+                <w:sz w:val="21"/>
+              </w:rPr>
+              <w:t xml:space="preserve">Default</w:t>
+            </w:r>
+            <w:r>
+              <w:rPr>
+                <w:rFonts w:ascii="Courier New" w:hAnsi="Courier New"/>
+                <w:color w:val="D4D4D4"/>
+                <w:sz w:val="21"/>
+              </w:rPr>
+              <w:t xml:space="preserve"> Switch Internal</w:t>
+            </w:r>
+          </w:p>
+          <w:p>
+            <w:r>
+              <w:rPr>
+                <w:rFonts w:ascii="Courier New" w:hAnsi="Courier New"/>
+                <w:color w:val="D4D4D4"/>
+                <w:sz w:val="21"/>
+              </w:rPr>
+              <w:t xml:space="preserve">KIFORMATOU     Internal</w:t>
+            </w:r>
+          </w:p>
+          <w:p>
+            <w:r>
+              <w:rPr>
+                <w:rFonts w:ascii="Courier New" w:hAnsi="Courier New"/>
+                <w:color w:val="D4D4D4"/>
+                <w:sz w:val="21"/>
+              </w:rPr>
+              <w:t xml:space="preserve">INTERNET       </w:t>
+            </w:r>
+            <w:r>
+              <w:rPr>
+                <w:rFonts w:ascii="Courier New" w:hAnsi="Courier New"/>
+                <w:color w:val="569CD6"/>
+                <w:sz w:val="21"/>
+              </w:rPr>
+              <w:t xml:space="preserve">External</w:t>
+            </w:r>
+            <w:r>
+              <w:rPr>
+                <w:rFonts w:ascii="Courier New" w:hAnsi="Courier New"/>
+                <w:color w:val="D4D4D4"/>
+                <w:sz w:val="21"/>
+              </w:rPr>
+              <w:t xml:space="preserve">   Realtek Gaming </w:t>
+            </w:r>
+            <w:r>
+              <w:rPr>
+                <w:rFonts w:ascii="Courier New" w:hAnsi="Courier New"/>
+                <w:color w:val="B5CEA8"/>
+                <w:sz w:val="21"/>
+              </w:rPr>
+              <w:t xml:space="preserve">2.5</w:t>
+            </w:r>
+            <w:r>
+              <w:rPr>
+                <w:rFonts w:ascii="Courier New" w:hAnsi="Courier New"/>
+                <w:color w:val="D4D4D4"/>
+                <w:sz w:val="21"/>
+              </w:rPr>
+              <w:t xml:space="preserve">GbE Family Controller</w:t>
+            </w:r>
+          </w:p>
+        </w:tc>
+      </w:tr>
+    </w:tbl>
+    <w:p>
+      <w:pPr>
+        <w:pStyle w:val="Normal"/>
+      </w:pPr>
+    </w:p>
+    <w:p>
+      <w:pPr>
+        <w:pStyle w:val="Normal"/>
+        <w:rPr>
+          <w:i/>
+          <w:iCs/>
+        </w:rPr>
+      </w:pPr>
+      <w:r>
+        <w:rPr>
+          <w:i/>
+          <w:iCs/>
+        </w:rPr>
+        <w:t xml:space="preserve">(WIP : Vous pouvez également copier le script du dépôt de travail pour cette section)</w:t>
+      </w:r>
+    </w:p>
+    <w:p>
+      <w:pPr>
+        <w:pStyle w:val="Normal"/>
+        <w:rPr>
+          <w:i/>
+          <w:iCs/>
+        </w:rPr>
+      </w:pPr>
+      <w:r>
+        <w:rPr>
+          <w:i/>
+          <w:iCs/>
+        </w:rPr>
+        <w:br w:type="page"/>
+      </w:r>
+    </w:p>
+    <w:p>
+      <w:pPr>
+        <w:pStyle w:val="Heading1"/>
+      </w:pPr>
+      <w:bookmarkStart w:id="6" w:name="_Toc000000037"/>
+      <w:r>
+        <w:t xml:space="preserve">Création de la VM IPFire</w:t>
+      </w:r>
+      <w:bookmarkEnd w:id="6"/>
+    </w:p>
+    <w:p>
+      <w:pPr>
+        <w:pStyle w:val="Normal"/>
+      </w:pPr>
+      <w:r>
+        <w:t xml:space="preserve">La VM IPFire fera office de routeur/pare-feu pour relier le LAN Kiformatou à Internet, la création se fera en PowerShell.</w:t>
+      </w:r>
+    </w:p>
+    <w:p>
+      <w:pPr>
+        <w:pStyle w:val="Normal"/>
+      </w:pPr>
+    </w:p>
+    <w:p>
+      <w:pPr>
         <w:pStyle w:val="Heading2"/>
       </w:pPr>
-      <w:bookmarkStart w:id="11" w:name="_Toc000000028"/>
+      <w:bookmarkStart w:id="7" w:name="_Toc000000038"/>
       <w:r>
-        <w:t xml:space="preserve">X.1. Créer une VM</w:t>
+        <w:t xml:space="preserve">1. Créer la VM</w:t>
       </w:r>
-      <w:bookmarkEnd w:id="11"/>
+      <w:bookmarkEnd w:id="7"/>
     </w:p>
+    <w:p>
+      <w:pPr>
+        <w:pStyle w:val="Normal"/>
+      </w:pPr>
+      <w:r>
+        <w:t xml:space="preserve">Vous pouvez exécuter le script suivant pour créer la VM en adaptant le chemin absolu :</w:t>
+      </w:r>
+    </w:p>
+    <w:tbl>
+      <w:tblPr>
+        <w:tblStyle w:val="TableGrid"/>
+        <w:tblW w:w="0" w:type="auto"/>
+        <w:tblLook w:val="04A0" w:firstRow="1" w:lastRow="0" w:firstColumn="1" w:lastColumn="0" w:noHBand="0" w:noVBand="1"/>
+      </w:tblPr>
+      <w:tblGrid>
+        <w:gridCol w:w="9524"/>
+      </w:tblGrid>
+      <w:tr>
+        <w:tc>
+          <w:tcPr>
+            <w:tcW w:w="9524" w:type="dxa"/>
+            <w:shd w:val="clear" w:color="auto" w:fill="000000"/>
+          </w:tcPr>
+          <w:p>
+            <w:pPr>
+              <w:rPr>
+                <w:rFonts w:ascii="Courier New" w:hAnsi="Courier New"/>
+                <w:i/>
+                <w:color w:val="6A9955"/>
+                <w:sz w:val="21"/>
+              </w:rPr>
+            </w:pPr>
+            <w:r>
+              <w:rPr>
+                <w:rFonts w:ascii="Courier New" w:hAnsi="Courier New"/>
+                <w:i/>
+                <w:color w:val="6A9955"/>
+                <w:sz w:val="21"/>
+              </w:rPr>
+              <w:t xml:space="preserve"># Configuration</w:t>
+            </w:r>
+          </w:p>
+          <w:p>
+            <w:r>
+              <w:rPr>
+                <w:rFonts w:ascii="Courier New" w:hAnsi="Courier New"/>
+                <w:color w:val="D4D4D4"/>
+                <w:sz w:val="21"/>
+              </w:rPr>
+              <w:t xml:space="preserve">$IPFire = [PSCustomObject]@{</w:t>
+            </w:r>
+          </w:p>
+          <w:p>
+            <w:r>
+              <w:rPr>
+                <w:rFonts w:ascii="Courier New" w:hAnsi="Courier New"/>
+                <w:color w:val="D4D4D4"/>
+                <w:sz w:val="21"/>
+              </w:rPr>
+              <w:t xml:space="preserve">    Name           = </w:t>
+            </w:r>
+            <w:r>
+              <w:rPr>
+                <w:rFonts w:ascii="Courier New" w:hAnsi="Courier New"/>
+                <w:color w:val="CE9178"/>
+                <w:sz w:val="21"/>
+              </w:rPr>
+              <w:t xml:space="preserve">"ipfire"</w:t>
+            </w:r>
+          </w:p>
+          <w:p>
+            <w:r>
+              <w:rPr>
+                <w:rFonts w:ascii="Courier New" w:hAnsi="Courier New"/>
+                <w:color w:val="D4D4D4"/>
+                <w:sz w:val="21"/>
+              </w:rPr>
+              <w:t xml:space="preserve">    Generation = </w:t>
+            </w:r>
+            <w:r>
+              <w:rPr>
+                <w:rFonts w:ascii="Courier New" w:hAnsi="Courier New"/>
+                <w:color w:val="B5CEA8"/>
+                <w:sz w:val="21"/>
+              </w:rPr>
+              <w:t xml:space="preserve">2</w:t>
+            </w:r>
+          </w:p>
+          <w:p>
+            <w:r>
+              <w:rPr>
+                <w:rFonts w:ascii="Courier New" w:hAnsi="Courier New"/>
+                <w:color w:val="D4D4D4"/>
+                <w:sz w:val="21"/>
+              </w:rPr>
+              <w:t xml:space="preserve">    CPUCount = </w:t>
+            </w:r>
+            <w:r>
+              <w:rPr>
+                <w:rFonts w:ascii="Courier New" w:hAnsi="Courier New"/>
+                <w:color w:val="B5CEA8"/>
+                <w:sz w:val="21"/>
+              </w:rPr>
+              <w:t xml:space="preserve">1</w:t>
+            </w:r>
+          </w:p>
+          <w:p>
+            <w:r>
+              <w:rPr>
+                <w:rFonts w:ascii="Courier New" w:hAnsi="Courier New"/>
+                <w:color w:val="D4D4D4"/>
+                <w:sz w:val="21"/>
+              </w:rPr>
+              <w:t xml:space="preserve">    VRAMBytes = </w:t>
+            </w:r>
+            <w:r>
+              <w:rPr>
+                <w:rFonts w:ascii="Courier New" w:hAnsi="Courier New"/>
+                <w:color w:val="B5CEA8"/>
+                <w:sz w:val="21"/>
+              </w:rPr>
+              <w:t xml:space="preserve">1</w:t>
+            </w:r>
+            <w:r>
+              <w:rPr>
+                <w:rFonts w:ascii="Courier New" w:hAnsi="Courier New"/>
+                <w:color w:val="D4D4D4"/>
+                <w:sz w:val="21"/>
+              </w:rPr>
+              <w:t xml:space="preserve">GB</w:t>
+            </w:r>
+          </w:p>
+          <w:p>
+            <w:r>
+              <w:rPr>
+                <w:rFonts w:ascii="Courier New" w:hAnsi="Courier New"/>
+                <w:color w:val="D4D4D4"/>
+                <w:sz w:val="21"/>
+              </w:rPr>
+              <w:t xml:space="preserve">    Path = </w:t>
+            </w:r>
+            <w:r>
+              <w:rPr>
+                <w:rFonts w:ascii="Courier New" w:hAnsi="Courier New"/>
+                <w:color w:val="CE9178"/>
+                <w:sz w:val="21"/>
+              </w:rPr>
+              <w:t xml:space="preserve">"V:\Kiformatou\ipfire"</w:t>
+            </w:r>
+          </w:p>
+          <w:p>
+            <w:r>
+              <w:rPr>
+                <w:rFonts w:ascii="Courier New" w:hAnsi="Courier New"/>
+                <w:color w:val="D4D4D4"/>
+                <w:sz w:val="21"/>
+              </w:rPr>
+              <w:t xml:space="preserve">    VHDPath = </w:t>
+            </w:r>
+            <w:r>
+              <w:rPr>
+                <w:rFonts w:ascii="Courier New" w:hAnsi="Courier New"/>
+                <w:color w:val="CE9178"/>
+                <w:sz w:val="21"/>
+              </w:rPr>
+              <w:t xml:space="preserve">"V:\Kiformatou\ipfire\ipfire.vhdx"</w:t>
+            </w:r>
+          </w:p>
+          <w:p>
+            <w:r>
+              <w:rPr>
+                <w:rFonts w:ascii="Courier New" w:hAnsi="Courier New"/>
+                <w:color w:val="D4D4D4"/>
+                <w:sz w:val="21"/>
+              </w:rPr>
+              <w:t xml:space="preserve">    VHDSizeBytes = </w:t>
+            </w:r>
+            <w:r>
+              <w:rPr>
+                <w:rFonts w:ascii="Courier New" w:hAnsi="Courier New"/>
+                <w:color w:val="B5CEA8"/>
+                <w:sz w:val="21"/>
+              </w:rPr>
+              <w:t xml:space="preserve">4</w:t>
+            </w:r>
+            <w:r>
+              <w:rPr>
+                <w:rFonts w:ascii="Courier New" w:hAnsi="Courier New"/>
+                <w:color w:val="D4D4D4"/>
+                <w:sz w:val="21"/>
+              </w:rPr>
+              <w:t xml:space="preserve">GB</w:t>
+            </w:r>
+          </w:p>
+          <w:p>
+            <w:r>
+              <w:rPr>
+                <w:rFonts w:ascii="Courier New" w:hAnsi="Courier New"/>
+                <w:color w:val="D4D4D4"/>
+                <w:sz w:val="21"/>
+              </w:rPr>
+              <w:t xml:space="preserve">    SwitchNameWAN = </w:t>
+            </w:r>
+            <w:r>
+              <w:rPr>
+                <w:rFonts w:ascii="Courier New" w:hAnsi="Courier New"/>
+                <w:color w:val="CE9178"/>
+                <w:sz w:val="21"/>
+              </w:rPr>
+              <w:t xml:space="preserve">"INTERNET"</w:t>
+            </w:r>
+          </w:p>
+          <w:p>
+            <w:r>
+              <w:rPr>
+                <w:rFonts w:ascii="Courier New" w:hAnsi="Courier New"/>
+                <w:color w:val="D4D4D4"/>
+                <w:sz w:val="21"/>
+              </w:rPr>
+              <w:t xml:space="preserve">    SwitchNameLAN    = </w:t>
+            </w:r>
+            <w:r>
+              <w:rPr>
+                <w:rFonts w:ascii="Courier New" w:hAnsi="Courier New"/>
+                <w:color w:val="CE9178"/>
+                <w:sz w:val="21"/>
+              </w:rPr>
+              <w:t xml:space="preserve">"KIFORMATOU"</w:t>
+            </w:r>
+          </w:p>
+          <w:p>
+            <w:r>
+              <w:rPr>
+                <w:rFonts w:ascii="Courier New" w:hAnsi="Courier New"/>
+                <w:color w:val="D4D4D4"/>
+                <w:sz w:val="21"/>
+              </w:rPr>
+              <w:t xml:space="preserve">    ISOPath = </w:t>
+            </w:r>
+            <w:r>
+              <w:rPr>
+                <w:rFonts w:ascii="Courier New" w:hAnsi="Courier New"/>
+                <w:color w:val="CE9178"/>
+                <w:sz w:val="21"/>
+              </w:rPr>
+              <w:t xml:space="preserve">"V:\ISO\ipfire-2.29.iso"</w:t>
+            </w:r>
+          </w:p>
+          <w:p>
+            <w:r>
+              <w:rPr>
+                <w:rFonts w:ascii="Courier New" w:hAnsi="Courier New"/>
+                <w:color w:val="D4D4D4"/>
+                <w:sz w:val="21"/>
+              </w:rPr>
+              <w:t xml:space="preserve">}</w:t>
+            </w:r>
+          </w:p>
+          <w:p/>
+          <w:p>
+            <w:r>
+              <w:rPr>
+                <w:rFonts w:ascii="Courier New" w:hAnsi="Courier New"/>
+                <w:i/>
+                <w:color w:val="6A9955"/>
+                <w:sz w:val="21"/>
+              </w:rPr>
+              <w:t xml:space="preserve"># Create the VM directory</w:t>
+            </w:r>
+          </w:p>
+          <w:p>
+            <w:r>
+              <w:rPr>
+                <w:rFonts w:ascii="Courier New" w:hAnsi="Courier New"/>
+                <w:color w:val="D4D4D4"/>
+                <w:sz w:val="21"/>
+              </w:rPr>
+              <w:t xml:space="preserve">New-Item -ItemType Directory -Path $IPFire.Path -Force | Out-Null</w:t>
+            </w:r>
+          </w:p>
+          <w:p/>
+          <w:p>
+            <w:r>
+              <w:rPr>
+                <w:rFonts w:ascii="Courier New" w:hAnsi="Courier New"/>
+                <w:i/>
+                <w:color w:val="6A9955"/>
+                <w:sz w:val="21"/>
+              </w:rPr>
+              <w:t xml:space="preserve"># Create a Generation 2 VM with 4 GB RAM and a 64 GB virtual disk</w:t>
+            </w:r>
+          </w:p>
+          <w:p>
+            <w:r>
+              <w:rPr>
+                <w:rFonts w:ascii="Courier New" w:hAnsi="Courier New"/>
+                <w:color w:val="D4D4D4"/>
+                <w:sz w:val="21"/>
+              </w:rPr>
+              <w:t xml:space="preserve">New-VM -Name $IPFire.Name </w:t>
+            </w:r>
+            <w:r>
+              <w:rPr>
+                <w:rFonts w:ascii="Courier New" w:hAnsi="Courier New"/>
+                <w:color w:val="CE9178"/>
+                <w:sz w:val="21"/>
+              </w:rPr>
+              <w:t xml:space="preserve">`</w:t>
+            </w:r>
+          </w:p>
+          <w:p>
+            <w:r>
+              <w:rPr>
+                <w:rFonts w:ascii="Courier New" w:hAnsi="Courier New"/>
+                <w:color w:val="D4D4D4"/>
+                <w:sz w:val="21"/>
+              </w:rPr>
+              <w:t xml:space="preserve">    -Generation $IPFire.Generation `</w:t>
+            </w:r>
+          </w:p>
+          <w:p>
+            <w:r>
+              <w:rPr>
+                <w:rFonts w:ascii="Courier New" w:hAnsi="Courier New"/>
+                <w:color w:val="D4D4D4"/>
+                <w:sz w:val="21"/>
+              </w:rPr>
+              <w:t xml:space="preserve">    -MemoryStartupBytes $IPFire.VRAMBytes </w:t>
+            </w:r>
+            <w:r>
+              <w:rPr>
+                <w:rFonts w:ascii="Courier New" w:hAnsi="Courier New"/>
+                <w:color w:val="CE9178"/>
+                <w:sz w:val="21"/>
+              </w:rPr>
+              <w:t xml:space="preserve">`</w:t>
+            </w:r>
+          </w:p>
+          <w:p>
+            <w:r>
+              <w:rPr>
+                <w:rFonts w:ascii="Courier New" w:hAnsi="Courier New"/>
+                <w:color w:val="D4D4D4"/>
+                <w:sz w:val="21"/>
+              </w:rPr>
+              <w:t xml:space="preserve">    -Path $IPFire.Path `</w:t>
+            </w:r>
+          </w:p>
+          <w:p>
+            <w:r>
+              <w:rPr>
+                <w:rFonts w:ascii="Courier New" w:hAnsi="Courier New"/>
+                <w:color w:val="D4D4D4"/>
+                <w:sz w:val="21"/>
+              </w:rPr>
+              <w:t xml:space="preserve">    -NewVHDPath $IPFire.VHDPath </w:t>
+            </w:r>
+            <w:r>
+              <w:rPr>
+                <w:rFonts w:ascii="Courier New" w:hAnsi="Courier New"/>
+                <w:color w:val="CE9178"/>
+                <w:sz w:val="21"/>
+              </w:rPr>
+              <w:t xml:space="preserve">`</w:t>
+            </w:r>
+          </w:p>
+          <w:p>
+            <w:r>
+              <w:rPr>
+                <w:rFonts w:ascii="Courier New" w:hAnsi="Courier New"/>
+                <w:color w:val="D4D4D4"/>
+                <w:sz w:val="21"/>
+              </w:rPr>
+              <w:t xml:space="preserve">    -NewVHDSizeBytes 8GB `</w:t>
+            </w:r>
+          </w:p>
+          <w:p>
+            <w:r>
+              <w:rPr>
+                <w:rFonts w:ascii="Courier New" w:hAnsi="Courier New"/>
+                <w:color w:val="D4D4D4"/>
+                <w:sz w:val="21"/>
+              </w:rPr>
+              <w:t xml:space="preserve">    -SwitchName $IPFire.SwitchNameWAN</w:t>
+            </w:r>
+          </w:p>
+          <w:p/>
+          <w:p>
+            <w:r>
+              <w:rPr>
+                <w:rFonts w:ascii="Courier New" w:hAnsi="Courier New"/>
+                <w:i/>
+                <w:color w:val="6A9955"/>
+                <w:sz w:val="21"/>
+              </w:rPr>
+              <w:t xml:space="preserve"># Assign 2 virtual processors and disable secure boot</w:t>
+            </w:r>
+          </w:p>
+          <w:p>
+            <w:r>
+              <w:rPr>
+                <w:rFonts w:ascii="Courier New" w:hAnsi="Courier New"/>
+                <w:color w:val="D4D4D4"/>
+                <w:sz w:val="21"/>
+              </w:rPr>
+              <w:t xml:space="preserve">Set-VMProcessor -VMName $IPFire.Name -Count $IPFire.CPUCount</w:t>
+            </w:r>
+          </w:p>
+          <w:p>
+            <w:r>
+              <w:rPr>
+                <w:rFonts w:ascii="Courier New" w:hAnsi="Courier New"/>
+                <w:color w:val="D4D4D4"/>
+                <w:sz w:val="21"/>
+              </w:rPr>
+              <w:t xml:space="preserve">Set-VMFirmware -VMName $IPFire.Name -EnableSecureBoot Off</w:t>
+            </w:r>
+          </w:p>
+          <w:p/>
+          <w:p>
+            <w:r>
+              <w:rPr>
+                <w:rFonts w:ascii="Courier New" w:hAnsi="Courier New"/>
+                <w:i/>
+                <w:color w:val="6A9955"/>
+                <w:sz w:val="21"/>
+              </w:rPr>
+              <w:t xml:space="preserve"># Attach the installation ISO and boot from it</w:t>
+            </w:r>
+          </w:p>
+          <w:p>
+            <w:r>
+              <w:rPr>
+                <w:rFonts w:ascii="Courier New" w:hAnsi="Courier New"/>
+                <w:color w:val="D4D4D4"/>
+                <w:sz w:val="21"/>
+              </w:rPr>
+              <w:t xml:space="preserve">$dvdDrive = Add-VMDvdDrive -VMName $IPFire.Name -Path $IPFire.ISOPath -Passthru</w:t>
+            </w:r>
+          </w:p>
+          <w:p>
+            <w:r>
+              <w:rPr>
+                <w:rFonts w:ascii="Courier New" w:hAnsi="Courier New"/>
+                <w:color w:val="D4D4D4"/>
+                <w:sz w:val="21"/>
+              </w:rPr>
+              <w:t xml:space="preserve">Set-VMFirmware -VMName $IPFire.Name -FirstBootDevice $dvdDrive</w:t>
+            </w:r>
+          </w:p>
+          <w:p/>
+          <w:p>
+            <w:r>
+              <w:rPr>
+                <w:rFonts w:ascii="Courier New" w:hAnsi="Courier New"/>
+                <w:i/>
+                <w:color w:val="6A9955"/>
+                <w:sz w:val="21"/>
+              </w:rPr>
+              <w:t xml:space="preserve"># Disable dynamic memory</w:t>
+            </w:r>
+          </w:p>
+          <w:p>
+            <w:r>
+              <w:rPr>
+                <w:rFonts w:ascii="Courier New" w:hAnsi="Courier New"/>
+                <w:color w:val="D4D4D4"/>
+                <w:sz w:val="21"/>
+              </w:rPr>
+              <w:t xml:space="preserve">Set-VMMemory -VMName $IPFire.Name -DynamicMemoryEnabled $false -StartupBytes </w:t>
+            </w:r>
+            <w:r>
+              <w:rPr>
+                <w:rFonts w:ascii="Courier New" w:hAnsi="Courier New"/>
+                <w:color w:val="B5CEA8"/>
+                <w:sz w:val="21"/>
+              </w:rPr>
+              <w:t xml:space="preserve">4</w:t>
+            </w:r>
+            <w:r>
+              <w:rPr>
+                <w:rFonts w:ascii="Courier New" w:hAnsi="Courier New"/>
+                <w:color w:val="D4D4D4"/>
+                <w:sz w:val="21"/>
+              </w:rPr>
+              <w:t xml:space="preserve">GB</w:t>
+            </w:r>
+          </w:p>
+          <w:p/>
+          <w:p>
+            <w:r>
+              <w:rPr>
+                <w:rFonts w:ascii="Courier New" w:hAnsi="Courier New"/>
+                <w:i/>
+                <w:color w:val="6A9955"/>
+                <w:sz w:val="21"/>
+              </w:rPr>
+              <w:t xml:space="preserve"># Add a second vNIC</w:t>
+            </w:r>
+          </w:p>
+          <w:p>
+            <w:r>
+              <w:rPr>
+                <w:rFonts w:ascii="Courier New" w:hAnsi="Courier New"/>
+                <w:color w:val="D4D4D4"/>
+                <w:sz w:val="21"/>
+              </w:rPr>
+              <w:t xml:space="preserve">Add-VMNetworkAdapter -VMName $IPFire.Name </w:t>
+            </w:r>
+            <w:r>
+              <w:rPr>
+                <w:rFonts w:ascii="Courier New" w:hAnsi="Courier New"/>
+                <w:color w:val="CE9178"/>
+                <w:sz w:val="21"/>
+              </w:rPr>
+              <w:t xml:space="preserve">`</w:t>
+            </w:r>
+          </w:p>
+          <w:p>
+            <w:r>
+              <w:rPr>
+                <w:rFonts w:ascii="Courier New" w:hAnsi="Courier New"/>
+                <w:color w:val="D4D4D4"/>
+                <w:sz w:val="21"/>
+              </w:rPr>
+              <w:t xml:space="preserve">    -Name $IPFire.SwitchNameLAN `</w:t>
+            </w:r>
+          </w:p>
+          <w:p>
+            <w:r>
+              <w:rPr>
+                <w:rFonts w:ascii="Courier New" w:hAnsi="Courier New"/>
+                <w:color w:val="D4D4D4"/>
+                <w:sz w:val="21"/>
+              </w:rPr>
+              <w:t xml:space="preserve">    -SwitchName $IPFire.SwitchNameLAN</w:t>
+            </w:r>
+          </w:p>
+          <w:p/>
+          <w:p>
+            <w:r>
+              <w:rPr>
+                <w:rFonts w:ascii="Courier New" w:hAnsi="Courier New"/>
+                <w:i/>
+                <w:color w:val="6A9955"/>
+                <w:sz w:val="21"/>
+              </w:rPr>
+              <w:t xml:space="preserve"># Display the VM status</w:t>
+            </w:r>
+          </w:p>
+          <w:p>
+            <w:r>
+              <w:rPr>
+                <w:rFonts w:ascii="Courier New" w:hAnsi="Courier New"/>
+                <w:color w:val="D4D4D4"/>
+                <w:sz w:val="21"/>
+              </w:rPr>
+              <w:t xml:space="preserve">Get-VM -Name $IPFire.Name</w:t>
+            </w:r>
+          </w:p>
+        </w:tc>
+      </w:tr>
+    </w:tbl>
     <w:p>
       <w:pPr>
         <w:rPr>
@@ -745,16 +2024,6 @@
     </w:p>
     <w:p>
       <w:pPr>
-        <w:pStyle w:val="Heading2"/>
-      </w:pPr>
-      <w:bookmarkStart w:id="12" w:name="_Toc000000029"/>
-      <w:r>
-        <w:t xml:space="preserve">X.2. Créer un vSwitch</w:t>
-      </w:r>
-      <w:bookmarkEnd w:id="12"/>
-    </w:p>
-    <w:p>
-      <w:pPr>
         <w:rPr>
           <w:b/>
         </w:rPr>
@@ -764,11 +2033,562 @@
       <w:pPr>
         <w:pStyle w:val="Heading2"/>
       </w:pPr>
-      <w:bookmarkStart w:id="13" w:name="_Toc000000030"/>
+      <w:bookmarkStart w:id="8" w:name="_Toc000000029"/>
       <w:r>
-        <w:t xml:space="preserve">X.3. Exporter une VM vers un hôte Hyper-V</w:t>
+        <w:t xml:space="preserve">2. Installer la VM</w:t>
       </w:r>
-      <w:bookmarkEnd w:id="13"/>
+      <w:bookmarkEnd w:id="8"/>
+    </w:p>
+    <w:p>
+      <w:pPr>
+        <w:rPr>
+          <w:b w:val="0"/>
+          <w:bCs w:val="0"/>
+        </w:rPr>
+      </w:pPr>
+      <w:r>
+        <w:rPr>
+          <w:b w:val="0"/>
+          <w:bCs w:val="0"/>
+        </w:rPr>
+        <w:t xml:space="preserve">Démarrez la VM (vous pouvez activer le guest services si vous rencontrez des problèmes d’affichage) :</w:t>
+      </w:r>
+    </w:p>
+    <w:tbl>
+      <w:tblPr>
+        <w:tblStyle w:val="TableGrid"/>
+        <w:tblW w:w="0" w:type="auto"/>
+        <w:tblLook w:val="04A0" w:firstRow="1" w:lastRow="0" w:firstColumn="1" w:lastColumn="0" w:noHBand="0" w:noVBand="1"/>
+      </w:tblPr>
+      <w:tblGrid>
+        <w:gridCol w:w="9524"/>
+      </w:tblGrid>
+      <w:tr>
+        <w:tc>
+          <w:tcPr>
+            <w:tcW w:w="9524" w:type="dxa"/>
+            <w:shd w:val="clear" w:color="auto" w:fill="000000"/>
+            <w:vAlign w:val="top"/>
+          </w:tcPr>
+          <w:p>
+            <w:pPr>
+              <w:jc w:val="left"/>
+              <w:rPr>
+                <w:rFonts w:ascii="Courier New" w:hAnsi="Courier New"/>
+                <w:color w:val="569CD6"/>
+                <w:sz w:val="21"/>
+              </w:rPr>
+            </w:pPr>
+            <w:r>
+              <w:rPr>
+                <w:rFonts w:ascii="Courier New" w:hAnsi="Courier New"/>
+                <w:color w:val="569CD6"/>
+                <w:sz w:val="21"/>
+              </w:rPr>
+              <w:t xml:space="preserve">Start</w:t>
+            </w:r>
+            <w:r>
+              <w:rPr>
+                <w:rFonts w:ascii="Courier New" w:hAnsi="Courier New"/>
+                <w:color w:val="D4D4D4"/>
+                <w:sz w:val="21"/>
+              </w:rPr>
+              <w:t xml:space="preserve">-VM -Name "ipfire"</w:t>
+            </w:r>
+          </w:p>
+          <w:p>
+            <w:r>
+              <w:rPr>
+                <w:rFonts w:ascii="Courier New" w:hAnsi="Courier New"/>
+                <w:color w:val="D4D4D4"/>
+                <w:sz w:val="21"/>
+              </w:rPr>
+              <w:t xml:space="preserve">vmconnect.exe localhost "ipfire"</w:t>
+            </w:r>
+          </w:p>
+        </w:tc>
+      </w:tr>
+    </w:tbl>
+    <w:p>
+      <w:pPr>
+        <w:rPr>
+          <w:b w:val="0"/>
+          <w:bCs w:val="0"/>
+        </w:rPr>
+      </w:pPr>
+    </w:p>
+    <w:p>
+      <w:pPr>
+        <w:rPr>
+          <w:b w:val="0"/>
+          <w:bCs w:val="0"/>
+        </w:rPr>
+      </w:pPr>
+      <w:r>
+        <w:rPr>
+          <w:b w:val="0"/>
+          <w:bCs w:val="0"/>
+        </w:rPr>
+        <w:t xml:space="preserve">Choisissez la première option :</w:t>
+      </w:r>
+    </w:p>
+    <w:p>
+      <w:pPr>
+        <w:rPr>
+          <w:b w:val="0"/>
+          <w:bCs w:val="0"/>
+        </w:rPr>
+      </w:pPr>
+      <w:r>
+        <w:drawing>
+          <wp:inline distT="0" distB="0" distL="0" distR="0">
+            <wp:extent cx="6047740" cy="4535805"/>
+            <wp:effectExtent l="0" t="0" r="0" b="0"/>
+            <wp:docPr id="3" name="Picture 3" descr=""/>
+            <wp:cNvGraphicFramePr/>
+            <a:graphic>
+              <a:graphicData uri="http://schemas.openxmlformats.org/drawingml/2006/picture">
+                <pic:pic>
+                  <pic:nvPicPr>
+                    <pic:cNvPr id="0" name="image7.png" descr=""/>
+                    <pic:cNvPicPr>
+                      <a:picLocks noChangeAspect="1" noChangeArrowheads="1"/>
+                    </pic:cNvPicPr>
+                  </pic:nvPicPr>
+                  <pic:blipFill>
+                    <a:blip r:embed="rId4"/>
+                    <a:stretch>
+                      <a:fillRect/>
+                    </a:stretch>
+                  </pic:blipFill>
+                  <pic:spPr bwMode="auto">
+                    <a:xfrm>
+                      <a:off x="0" y="0"/>
+                      <a:ext cx="6047740" cy="4535805"/>
+                    </a:xfrm>
+                    <a:prstGeom prst="rect">
+                      <a:avLst/>
+                    </a:prstGeom>
+                  </pic:spPr>
+                </pic:pic>
+              </a:graphicData>
+            </a:graphic>
+          </wp:inline>
+        </w:drawing>
+      </w:r>
+    </w:p>
+    <w:p>
+      <w:pPr>
+        <w:rPr>
+          <w:b w:val="0"/>
+          <w:bCs w:val="0"/>
+        </w:rPr>
+      </w:pPr>
+    </w:p>
+    <w:p>
+      <w:pPr>
+        <w:rPr>
+          <w:b w:val="0"/>
+          <w:bCs w:val="0"/>
+        </w:rPr>
+      </w:pPr>
+      <w:r>
+        <w:rPr>
+          <w:b w:val="0"/>
+          <w:bCs w:val="0"/>
+        </w:rPr>
+        <w:t xml:space="preserve">Choisissez “English” :</w:t>
+      </w:r>
+    </w:p>
+    <w:p>
+      <w:pPr>
+        <w:rPr>
+          <w:b w:val="0"/>
+          <w:bCs w:val="0"/>
+        </w:rPr>
+      </w:pPr>
+      <w:r>
+        <w:rPr>
+          <w:b w:val="0"/>
+          <w:bCs w:val="0"/>
+        </w:rPr>
+        <w:drawing>
+          <wp:inline distT="0" distB="0" distL="0" distR="0">
+            <wp:extent cx="6047740" cy="4535805"/>
+            <wp:effectExtent l="0" t="0" r="0" b="0"/>
+            <wp:docPr id="4" name="Picture 4" descr=""/>
+            <wp:cNvGraphicFramePr/>
+            <a:graphic>
+              <a:graphicData uri="http://schemas.openxmlformats.org/drawingml/2006/picture">
+                <pic:pic>
+                  <pic:nvPicPr>
+                    <pic:cNvPr id="0" name="image8.png" descr=""/>
+                    <pic:cNvPicPr>
+                      <a:picLocks noChangeAspect="1" noChangeArrowheads="1"/>
+                    </pic:cNvPicPr>
+                  </pic:nvPicPr>
+                  <pic:blipFill>
+                    <a:blip r:embed="rId5"/>
+                    <a:stretch>
+                      <a:fillRect/>
+                    </a:stretch>
+                  </pic:blipFill>
+                  <pic:spPr bwMode="auto">
+                    <a:xfrm>
+                      <a:off x="0" y="0"/>
+                      <a:ext cx="6047740" cy="4535805"/>
+                    </a:xfrm>
+                    <a:prstGeom prst="rect">
+                      <a:avLst/>
+                    </a:prstGeom>
+                  </pic:spPr>
+                </pic:pic>
+              </a:graphicData>
+            </a:graphic>
+          </wp:inline>
+        </w:drawing>
+      </w:r>
+    </w:p>
+    <w:p>
+      <w:pPr>
+        <w:rPr>
+          <w:b w:val="0"/>
+          <w:bCs w:val="0"/>
+        </w:rPr>
+      </w:pPr>
+    </w:p>
+    <w:p>
+      <w:pPr>
+        <w:rPr>
+          <w:b w:val="0"/>
+          <w:bCs w:val="0"/>
+        </w:rPr>
+      </w:pPr>
+    </w:p>
+    <w:p>
+      <w:pPr>
+        <w:rPr>
+          <w:b w:val="0"/>
+          <w:bCs w:val="0"/>
+        </w:rPr>
+      </w:pPr>
+    </w:p>
+    <w:p>
+      <w:pPr>
+        <w:rPr>
+          <w:b w:val="0"/>
+          <w:bCs w:val="0"/>
+        </w:rPr>
+      </w:pPr>
+      <w:r>
+        <w:rPr>
+          <w:b w:val="0"/>
+          <w:bCs w:val="0"/>
+        </w:rPr>
+        <w:t xml:space="preserve">Appuyez sur </w:t>
+      </w:r>
+      <w:r>
+        <w:rPr>
+          <w:b/>
+          <w:bCs/>
+        </w:rPr>
+        <w:t xml:space="preserve">Entrée :</w:t>
+      </w:r>
+    </w:p>
+    <w:p>
+      <w:pPr>
+        <w:rPr>
+          <w:b/>
+          <w:bCs/>
+        </w:rPr>
+      </w:pPr>
+      <w:r>
+        <w:rPr>
+          <w:b w:val="0"/>
+          <w:bCs w:val="0"/>
+        </w:rPr>
+        <w:drawing>
+          <wp:inline distT="0" distB="0" distL="0" distR="0">
+            <wp:extent cx="6047740" cy="4535805"/>
+            <wp:effectExtent l="0" t="0" r="0" b="0"/>
+            <wp:docPr id="5" name="Picture 5" descr=""/>
+            <wp:cNvGraphicFramePr/>
+            <a:graphic>
+              <a:graphicData uri="http://schemas.openxmlformats.org/drawingml/2006/picture">
+                <pic:pic>
+                  <pic:nvPicPr>
+                    <pic:cNvPr id="0" name="image9.png" descr=""/>
+                    <pic:cNvPicPr>
+                      <a:picLocks noChangeAspect="1" noChangeArrowheads="1"/>
+                    </pic:cNvPicPr>
+                  </pic:nvPicPr>
+                  <pic:blipFill>
+                    <a:blip r:embed="rId6"/>
+                    <a:stretch>
+                      <a:fillRect/>
+                    </a:stretch>
+                  </pic:blipFill>
+                  <pic:spPr bwMode="auto">
+                    <a:xfrm>
+                      <a:off x="0" y="0"/>
+                      <a:ext cx="6047740" cy="4535805"/>
+                    </a:xfrm>
+                    <a:prstGeom prst="rect">
+                      <a:avLst/>
+                    </a:prstGeom>
+                  </pic:spPr>
+                </pic:pic>
+              </a:graphicData>
+            </a:graphic>
+          </wp:inline>
+        </w:drawing>
+      </w:r>
+    </w:p>
+    <w:p>
+      <w:pPr>
+        <w:rPr>
+          <w:b w:val="0"/>
+          <w:bCs w:val="0"/>
+        </w:rPr>
+      </w:pPr>
+    </w:p>
+    <w:p>
+      <w:pPr>
+        <w:rPr>
+          <w:b w:val="0"/>
+          <w:bCs w:val="0"/>
+        </w:rPr>
+      </w:pPr>
+      <w:r>
+        <w:rPr>
+          <w:b w:val="0"/>
+          <w:bCs w:val="0"/>
+        </w:rPr>
+        <w:drawing>
+          <wp:inline distT="0" distB="0" distL="0" distR="0">
+            <wp:extent cx="6047740" cy="4535805"/>
+            <wp:effectExtent l="0" t="0" r="0" b="0"/>
+            <wp:docPr id="6" name="Picture 6" descr=""/>
+            <wp:cNvGraphicFramePr/>
+            <a:graphic>
+              <a:graphicData uri="http://schemas.openxmlformats.org/drawingml/2006/picture">
+                <pic:pic>
+                  <pic:nvPicPr>
+                    <pic:cNvPr id="0" name="image10.png" descr=""/>
+                    <pic:cNvPicPr>
+                      <a:picLocks noChangeAspect="1" noChangeArrowheads="1"/>
+                    </pic:cNvPicPr>
+                  </pic:nvPicPr>
+                  <pic:blipFill>
+                    <a:blip r:embed="rId7"/>
+                    <a:stretch>
+                      <a:fillRect/>
+                    </a:stretch>
+                  </pic:blipFill>
+                  <pic:spPr bwMode="auto">
+                    <a:xfrm>
+                      <a:off x="0" y="0"/>
+                      <a:ext cx="6047740" cy="4535805"/>
+                    </a:xfrm>
+                    <a:prstGeom prst="rect">
+                      <a:avLst/>
+                    </a:prstGeom>
+                  </pic:spPr>
+                </pic:pic>
+              </a:graphicData>
+            </a:graphic>
+          </wp:inline>
+        </w:drawing>
+      </w:r>
+    </w:p>
+    <w:p>
+      <w:pPr>
+        <w:rPr>
+          <w:b w:val="0"/>
+          <w:bCs w:val="0"/>
+        </w:rPr>
+      </w:pPr>
+      <w:r>
+        <w:rPr>
+          <w:b w:val="0"/>
+          <w:bCs w:val="0"/>
+        </w:rPr>
+        <w:t xml:space="preserve">Choisissez Delete all data :</w:t>
+      </w:r>
+    </w:p>
+    <w:p>
+      <w:pPr>
+        <w:rPr>
+          <w:b w:val="0"/>
+          <w:bCs w:val="0"/>
+        </w:rPr>
+      </w:pPr>
+    </w:p>
+    <w:p>
+      <w:pPr>
+        <w:rPr>
+          <w:b w:val="0"/>
+          <w:bCs w:val="0"/>
+        </w:rPr>
+      </w:pPr>
+      <w:r>
+        <w:rPr>
+          <w:b w:val="0"/>
+          <w:bCs w:val="0"/>
+        </w:rPr>
+        <w:drawing>
+          <wp:inline distT="0" distB="0" distL="0" distR="0">
+            <wp:extent cx="6047740" cy="4535805"/>
+            <wp:effectExtent l="0" t="0" r="0" b="0"/>
+            <wp:docPr id="7" name="Picture 7" descr=""/>
+            <wp:cNvGraphicFramePr/>
+            <a:graphic>
+              <a:graphicData uri="http://schemas.openxmlformats.org/drawingml/2006/picture">
+                <pic:pic>
+                  <pic:nvPicPr>
+                    <pic:cNvPr id="0" name="image11.png" descr=""/>
+                    <pic:cNvPicPr>
+                      <a:picLocks noChangeAspect="1" noChangeArrowheads="1"/>
+                    </pic:cNvPicPr>
+                  </pic:nvPicPr>
+                  <pic:blipFill>
+                    <a:blip r:embed="rId8"/>
+                    <a:stretch>
+                      <a:fillRect/>
+                    </a:stretch>
+                  </pic:blipFill>
+                  <pic:spPr bwMode="auto">
+                    <a:xfrm>
+                      <a:off x="0" y="0"/>
+                      <a:ext cx="6047740" cy="4535805"/>
+                    </a:xfrm>
+                    <a:prstGeom prst="rect">
+                      <a:avLst/>
+                    </a:prstGeom>
+                  </pic:spPr>
+                </pic:pic>
+              </a:graphicData>
+            </a:graphic>
+          </wp:inline>
+        </w:drawing>
+      </w:r>
+    </w:p>
+    <w:p>
+      <w:pPr>
+        <w:rPr>
+          <w:b w:val="0"/>
+          <w:bCs w:val="0"/>
+        </w:rPr>
+      </w:pPr>
+      <w:r>
+        <w:rPr>
+          <w:b w:val="0"/>
+          <w:bCs w:val="0"/>
+        </w:rPr>
+        <w:t xml:space="preserve">Choisissez l’option par défaut </w:t>
+      </w:r>
+      <w:r>
+        <w:rPr>
+          <w:b/>
+          <w:bCs/>
+        </w:rPr>
+        <w:t xml:space="preserve">ext4 Filesystem</w:t>
+      </w:r>
+    </w:p>
+    <w:p>
+      <w:pPr>
+        <w:rPr>
+          <w:b/>
+          <w:bCs/>
+        </w:rPr>
+      </w:pPr>
+    </w:p>
+    <w:p>
+      <w:pPr>
+        <w:rPr>
+          <w:b w:val="0"/>
+          <w:bCs w:val="0"/>
+        </w:rPr>
+      </w:pPr>
+      <w:r>
+        <w:rPr>
+          <w:b w:val="0"/>
+          <w:bCs w:val="0"/>
+        </w:rPr>
+        <w:drawing>
+          <wp:inline distT="0" distB="0" distL="0" distR="0">
+            <wp:extent cx="6047740" cy="4535805"/>
+            <wp:effectExtent l="0" t="0" r="0" b="0"/>
+            <wp:docPr id="8" name="Picture 8" descr=""/>
+            <wp:cNvGraphicFramePr/>
+            <a:graphic>
+              <a:graphicData uri="http://schemas.openxmlformats.org/drawingml/2006/picture">
+                <pic:pic>
+                  <pic:nvPicPr>
+                    <pic:cNvPr id="0" name="image12.png" descr=""/>
+                    <pic:cNvPicPr>
+                      <a:picLocks noChangeAspect="1" noChangeArrowheads="1"/>
+                    </pic:cNvPicPr>
+                  </pic:nvPicPr>
+                  <pic:blipFill>
+                    <a:blip r:embed="rId9"/>
+                    <a:stretch>
+                      <a:fillRect/>
+                    </a:stretch>
+                  </pic:blipFill>
+                  <pic:spPr bwMode="auto">
+                    <a:xfrm>
+                      <a:off x="0" y="0"/>
+                      <a:ext cx="6047740" cy="4535805"/>
+                    </a:xfrm>
+                    <a:prstGeom prst="rect">
+                      <a:avLst/>
+                    </a:prstGeom>
+                  </pic:spPr>
+                </pic:pic>
+              </a:graphicData>
+            </a:graphic>
+          </wp:inline>
+        </w:drawing>
+      </w:r>
+    </w:p>
+    <w:p>
+      <w:pPr>
+        <w:rPr>
+          <w:b w:val="0"/>
+          <w:bCs w:val="0"/>
+        </w:rPr>
+      </w:pPr>
+      <w:r>
+        <w:rPr>
+          <w:b w:val="0"/>
+          <w:bCs w:val="0"/>
+        </w:rPr>
+        <w:t xml:space="preserve">Procédez à l’installation puis redémarrer la VM.</w:t>
+      </w:r>
+    </w:p>
+    <w:p>
+      <w:pPr>
+        <w:rPr>
+          <w:b w:val="0"/>
+          <w:bCs w:val="0"/>
+        </w:rPr>
+      </w:pPr>
+    </w:p>
+    <w:p>
+      <w:pPr>
+        <w:rPr>
+          <w:b w:val="0"/>
+          <w:bCs w:val="0"/>
+        </w:rPr>
+      </w:pPr>
+      <w:r>
+        <w:rPr>
+          <w:b w:val="0"/>
+          <w:bCs w:val="0"/>
+        </w:rPr>
+        <w:t xml:space="preserve">Après le redémarage, choisissez la première option :</w:t>
+      </w:r>
     </w:p>
     <w:p>
       <w:pPr>
@@ -778,38 +2598,1722 @@
       </w:pPr>
     </w:p>
     <w:p>
+      <w:r>
+        <w:drawing>
+          <wp:inline distT="0" distB="0" distL="0" distR="0">
+            <wp:extent cx="6047740" cy="4535805"/>
+            <wp:effectExtent l="0" t="0" r="0" b="0"/>
+            <wp:docPr id="9" name="Picture 9" descr=""/>
+            <wp:cNvGraphicFramePr/>
+            <a:graphic>
+              <a:graphicData uri="http://schemas.openxmlformats.org/drawingml/2006/picture">
+                <pic:pic>
+                  <pic:nvPicPr>
+                    <pic:cNvPr id="0" name="image13.png" descr=""/>
+                    <pic:cNvPicPr>
+                      <a:picLocks noChangeAspect="1" noChangeArrowheads="1"/>
+                    </pic:cNvPicPr>
+                  </pic:nvPicPr>
+                  <pic:blipFill>
+                    <a:blip r:embed="rId10"/>
+                    <a:stretch>
+                      <a:fillRect/>
+                    </a:stretch>
+                  </pic:blipFill>
+                  <pic:spPr bwMode="auto">
+                    <a:xfrm>
+                      <a:off x="0" y="0"/>
+                      <a:ext cx="6047740" cy="4535805"/>
+                    </a:xfrm>
+                    <a:prstGeom prst="rect">
+                      <a:avLst/>
+                    </a:prstGeom>
+                  </pic:spPr>
+                </pic:pic>
+              </a:graphicData>
+            </a:graphic>
+          </wp:inline>
+        </w:drawing>
+      </w:r>
       <w:r>
         <w:br w:type="page"/>
       </w:r>
     </w:p>
     <w:p>
+      <w:r>
+        <w:t xml:space="preserve">Prennez l’option </w:t>
+      </w:r>
+      <w:r>
+        <w:rPr>
+          <w:b/>
+          <w:bCs/>
+        </w:rPr>
+        <w:t xml:space="preserve">fr </w:t>
+      </w:r>
+      <w:r>
+        <w:rPr>
+          <w:b w:val="0"/>
+          <w:bCs w:val="0"/>
+        </w:rPr>
+        <w:t xml:space="preserve">pour les touches du clavier :</w:t>
+      </w:r>
+    </w:p>
+    <w:p>
+      <w:pPr>
+        <w:rPr>
+          <w:b w:val="0"/>
+          <w:bCs w:val="0"/>
+        </w:rPr>
+      </w:pPr>
+      <w:r>
+        <w:rPr>
+          <w:b w:val="0"/>
+          <w:bCs w:val="0"/>
+        </w:rPr>
+        <w:drawing>
+          <wp:inline distT="0" distB="0" distL="0" distR="0">
+            <wp:extent cx="6047740" cy="4535805"/>
+            <wp:effectExtent l="0" t="0" r="0" b="0"/>
+            <wp:docPr id="10" name="Picture 10" descr=""/>
+            <wp:cNvGraphicFramePr/>
+            <a:graphic>
+              <a:graphicData uri="http://schemas.openxmlformats.org/drawingml/2006/picture">
+                <pic:pic>
+                  <pic:nvPicPr>
+                    <pic:cNvPr id="0" name="image14.png" descr=""/>
+                    <pic:cNvPicPr>
+                      <a:picLocks noChangeAspect="1" noChangeArrowheads="1"/>
+                    </pic:cNvPicPr>
+                  </pic:nvPicPr>
+                  <pic:blipFill>
+                    <a:blip r:embed="rId11"/>
+                    <a:stretch>
+                      <a:fillRect/>
+                    </a:stretch>
+                  </pic:blipFill>
+                  <pic:spPr bwMode="auto">
+                    <a:xfrm>
+                      <a:off x="0" y="0"/>
+                      <a:ext cx="6047740" cy="4535805"/>
+                    </a:xfrm>
+                    <a:prstGeom prst="rect">
+                      <a:avLst/>
+                    </a:prstGeom>
+                  </pic:spPr>
+                </pic:pic>
+              </a:graphicData>
+            </a:graphic>
+          </wp:inline>
+        </w:drawing>
+      </w:r>
+    </w:p>
+    <w:p>
       <w:pPr>
         <w:pStyle w:val="Heading1"/>
       </w:pPr>
-      <w:bookmarkStart w:id="14" w:name="_Toc000000021"/>
-      <w:bookmarkStart w:id="15" w:name="azure_section_21"/>
+    </w:p>
+    <w:p>
+      <w:pPr>
+        <w:pStyle w:val="Normal"/>
+      </w:pPr>
+      <w:r>
+        <w:t xml:space="preserve">Choisissez Europe/Paris :</w:t>
+      </w:r>
+    </w:p>
+    <w:p>
+      <w:pPr>
+        <w:pStyle w:val="Normal"/>
+      </w:pPr>
+      <w:r>
+        <w:drawing>
+          <wp:inline distT="0" distB="0" distL="0" distR="0">
+            <wp:extent cx="6047740" cy="4535805"/>
+            <wp:effectExtent l="0" t="0" r="0" b="0"/>
+            <wp:docPr id="11" name="Picture 11" descr=""/>
+            <wp:cNvGraphicFramePr/>
+            <a:graphic>
+              <a:graphicData uri="http://schemas.openxmlformats.org/drawingml/2006/picture">
+                <pic:pic>
+                  <pic:nvPicPr>
+                    <pic:cNvPr id="0" name="image15.png" descr=""/>
+                    <pic:cNvPicPr>
+                      <a:picLocks noChangeAspect="1" noChangeArrowheads="1"/>
+                    </pic:cNvPicPr>
+                  </pic:nvPicPr>
+                  <pic:blipFill>
+                    <a:blip r:embed="rId12"/>
+                    <a:stretch>
+                      <a:fillRect/>
+                    </a:stretch>
+                  </pic:blipFill>
+                  <pic:spPr bwMode="auto">
+                    <a:xfrm>
+                      <a:off x="0" y="0"/>
+                      <a:ext cx="6047740" cy="4535805"/>
+                    </a:xfrm>
+                    <a:prstGeom prst="rect">
+                      <a:avLst/>
+                    </a:prstGeom>
+                  </pic:spPr>
+                </pic:pic>
+              </a:graphicData>
+            </a:graphic>
+          </wp:inline>
+        </w:drawing>
+      </w:r>
+    </w:p>
+    <w:p>
+      <w:pPr>
+        <w:pStyle w:val="Normal"/>
+      </w:pPr>
+    </w:p>
+    <w:p>
+      <w:pPr>
+        <w:pStyle w:val="Normal"/>
+      </w:pPr>
+      <w:r>
+        <w:t xml:space="preserve">Conservez le hostname “ipfire” :</w:t>
+      </w:r>
+    </w:p>
+    <w:p>
+      <w:pPr>
+        <w:pStyle w:val="Normal"/>
+      </w:pPr>
+      <w:r>
+        <w:drawing>
+          <wp:inline distT="0" distB="0" distL="0" distR="0">
+            <wp:extent cx="6047740" cy="4535805"/>
+            <wp:effectExtent l="0" t="0" r="0" b="0"/>
+            <wp:docPr id="12" name="Picture 12" descr=""/>
+            <wp:cNvGraphicFramePr/>
+            <a:graphic>
+              <a:graphicData uri="http://schemas.openxmlformats.org/drawingml/2006/picture">
+                <pic:pic>
+                  <pic:nvPicPr>
+                    <pic:cNvPr id="0" name="image16.png" descr=""/>
+                    <pic:cNvPicPr>
+                      <a:picLocks noChangeAspect="1" noChangeArrowheads="1"/>
+                    </pic:cNvPicPr>
+                  </pic:nvPicPr>
+                  <pic:blipFill>
+                    <a:blip r:embed="rId13"/>
+                    <a:stretch>
+                      <a:fillRect/>
+                    </a:stretch>
+                  </pic:blipFill>
+                  <pic:spPr bwMode="auto">
+                    <a:xfrm>
+                      <a:off x="0" y="0"/>
+                      <a:ext cx="6047740" cy="4535805"/>
+                    </a:xfrm>
+                    <a:prstGeom prst="rect">
+                      <a:avLst/>
+                    </a:prstGeom>
+                  </pic:spPr>
+                </pic:pic>
+              </a:graphicData>
+            </a:graphic>
+          </wp:inline>
+        </w:drawing>
+      </w:r>
+    </w:p>
+    <w:p>
+      <w:pPr>
+        <w:pStyle w:val="Normal"/>
+      </w:pPr>
+    </w:p>
+    <w:p>
+      <w:pPr>
+        <w:pStyle w:val="Normal"/>
+      </w:pPr>
+      <w:r>
+        <w:t xml:space="preserve">Ne pas changez le nom de domaine (on le fera plus tard) :</w:t>
+      </w:r>
+    </w:p>
+    <w:p>
+      <w:pPr>
+        <w:pStyle w:val="Normal"/>
+      </w:pPr>
+      <w:r>
+        <w:drawing>
+          <wp:inline distT="0" distB="0" distL="0" distR="0">
+            <wp:extent cx="6047740" cy="4535805"/>
+            <wp:effectExtent l="0" t="0" r="0" b="0"/>
+            <wp:docPr id="13" name="Picture 13" descr=""/>
+            <wp:cNvGraphicFramePr/>
+            <a:graphic>
+              <a:graphicData uri="http://schemas.openxmlformats.org/drawingml/2006/picture">
+                <pic:pic>
+                  <pic:nvPicPr>
+                    <pic:cNvPr id="0" name="image17.png" descr=""/>
+                    <pic:cNvPicPr>
+                      <a:picLocks noChangeAspect="1" noChangeArrowheads="1"/>
+                    </pic:cNvPicPr>
+                  </pic:nvPicPr>
+                  <pic:blipFill>
+                    <a:blip r:embed="rId14"/>
+                    <a:stretch>
+                      <a:fillRect/>
+                    </a:stretch>
+                  </pic:blipFill>
+                  <pic:spPr bwMode="auto">
+                    <a:xfrm>
+                      <a:off x="0" y="0"/>
+                      <a:ext cx="6047740" cy="4535805"/>
+                    </a:xfrm>
+                    <a:prstGeom prst="rect">
+                      <a:avLst/>
+                    </a:prstGeom>
+                  </pic:spPr>
+                </pic:pic>
+              </a:graphicData>
+            </a:graphic>
+          </wp:inline>
+        </w:drawing>
+      </w:r>
+    </w:p>
+    <w:p>
+      <w:pPr>
+        <w:pStyle w:val="Heading1"/>
+      </w:pPr>
+    </w:p>
+    <w:p>
+      <w:pPr>
+        <w:pStyle w:val="Normal"/>
+      </w:pPr>
+      <w:r>
+        <w:t xml:space="preserve">Entrez le mot de passe de votre choix pour le root :</w:t>
+      </w:r>
+    </w:p>
+    <w:p>
+      <w:pPr>
+        <w:pStyle w:val="Normal"/>
+      </w:pPr>
+      <w:r>
+        <w:drawing>
+          <wp:inline distT="0" distB="0" distL="0" distR="0">
+            <wp:extent cx="6047740" cy="4535805"/>
+            <wp:effectExtent l="0" t="0" r="0" b="0"/>
+            <wp:docPr id="14" name="Picture 14" descr=""/>
+            <wp:cNvGraphicFramePr/>
+            <a:graphic>
+              <a:graphicData uri="http://schemas.openxmlformats.org/drawingml/2006/picture">
+                <pic:pic>
+                  <pic:nvPicPr>
+                    <pic:cNvPr id="0" name="image18.png" descr=""/>
+                    <pic:cNvPicPr>
+                      <a:picLocks noChangeAspect="1" noChangeArrowheads="1"/>
+                    </pic:cNvPicPr>
+                  </pic:nvPicPr>
+                  <pic:blipFill>
+                    <a:blip r:embed="rId15"/>
+                    <a:stretch>
+                      <a:fillRect/>
+                    </a:stretch>
+                  </pic:blipFill>
+                  <pic:spPr bwMode="auto">
+                    <a:xfrm>
+                      <a:off x="0" y="0"/>
+                      <a:ext cx="6047740" cy="4535805"/>
+                    </a:xfrm>
+                    <a:prstGeom prst="rect">
+                      <a:avLst/>
+                    </a:prstGeom>
+                  </pic:spPr>
+                </pic:pic>
+              </a:graphicData>
+            </a:graphic>
+          </wp:inline>
+        </w:drawing>
+      </w:r>
+    </w:p>
+    <w:p>
+      <w:pPr>
+        <w:pStyle w:val="Heading1"/>
+      </w:pPr>
+    </w:p>
+    <w:p>
+      <w:pPr>
+        <w:pStyle w:val="Normal"/>
+      </w:pPr>
+      <w:r>
+        <w:t xml:space="preserve">Pareil pour le compte admin :</w:t>
+      </w:r>
+    </w:p>
+    <w:p>
+      <w:pPr>
+        <w:pStyle w:val="Normal"/>
+      </w:pPr>
+      <w:r>
+        <w:drawing>
+          <wp:inline distT="0" distB="0" distL="0" distR="0">
+            <wp:extent cx="6047740" cy="4535805"/>
+            <wp:effectExtent l="0" t="0" r="0" b="0"/>
+            <wp:docPr id="15" name="Picture 15" descr=""/>
+            <wp:cNvGraphicFramePr/>
+            <a:graphic>
+              <a:graphicData uri="http://schemas.openxmlformats.org/drawingml/2006/picture">
+                <pic:pic>
+                  <pic:nvPicPr>
+                    <pic:cNvPr id="0" name="image19.png" descr=""/>
+                    <pic:cNvPicPr>
+                      <a:picLocks noChangeAspect="1" noChangeArrowheads="1"/>
+                    </pic:cNvPicPr>
+                  </pic:nvPicPr>
+                  <pic:blipFill>
+                    <a:blip r:embed="rId16"/>
+                    <a:stretch>
+                      <a:fillRect/>
+                    </a:stretch>
+                  </pic:blipFill>
+                  <pic:spPr bwMode="auto">
+                    <a:xfrm>
+                      <a:off x="0" y="0"/>
+                      <a:ext cx="6047740" cy="4535805"/>
+                    </a:xfrm>
+                    <a:prstGeom prst="rect">
+                      <a:avLst/>
+                    </a:prstGeom>
+                  </pic:spPr>
+                </pic:pic>
+              </a:graphicData>
+            </a:graphic>
+          </wp:inline>
+        </w:drawing>
+      </w:r>
+    </w:p>
+    <w:p>
+      <w:pPr>
+        <w:pStyle w:val="Normal"/>
+      </w:pPr>
+    </w:p>
+    <w:p>
+      <w:pPr>
+        <w:pStyle w:val="Normal"/>
+      </w:pPr>
+      <w:r>
+        <w:t xml:space="preserve">Pour la configuration réseau, commencez par le type : </w:t>
+      </w:r>
+    </w:p>
+    <w:p>
+      <w:pPr>
+        <w:pStyle w:val="Normal"/>
+      </w:pPr>
+      <w:r>
+        <w:drawing>
+          <wp:inline distT="0" distB="0" distL="0" distR="0">
+            <wp:extent cx="6047740" cy="4535805"/>
+            <wp:effectExtent l="0" t="0" r="0" b="0"/>
+            <wp:docPr id="16" name="Picture 16" descr=""/>
+            <wp:cNvGraphicFramePr/>
+            <a:graphic>
+              <a:graphicData uri="http://schemas.openxmlformats.org/drawingml/2006/picture">
+                <pic:pic>
+                  <pic:nvPicPr>
+                    <pic:cNvPr id="0" name="image20.png" descr=""/>
+                    <pic:cNvPicPr>
+                      <a:picLocks noChangeAspect="1" noChangeArrowheads="1"/>
+                    </pic:cNvPicPr>
+                  </pic:nvPicPr>
+                  <pic:blipFill>
+                    <a:blip r:embed="rId17"/>
+                    <a:stretch>
+                      <a:fillRect/>
+                    </a:stretch>
+                  </pic:blipFill>
+                  <pic:spPr bwMode="auto">
+                    <a:xfrm>
+                      <a:off x="0" y="0"/>
+                      <a:ext cx="6047740" cy="4535805"/>
+                    </a:xfrm>
+                    <a:prstGeom prst="rect">
+                      <a:avLst/>
+                    </a:prstGeom>
+                  </pic:spPr>
+                </pic:pic>
+              </a:graphicData>
+            </a:graphic>
+          </wp:inline>
+        </w:drawing>
+      </w:r>
+    </w:p>
+    <w:p>
+      <w:pPr>
+        <w:pStyle w:val="Normal"/>
+      </w:pPr>
+    </w:p>
+    <w:p>
+      <w:pPr>
+        <w:pStyle w:val="Normal"/>
+      </w:pPr>
+      <w:r>
+        <w:t xml:space="preserve">Prennez l’option GREEN + REDE :</w:t>
+      </w:r>
+    </w:p>
+    <w:p>
+      <w:pPr>
+        <w:pStyle w:val="Normal"/>
+      </w:pPr>
+      <w:r>
+        <w:drawing>
+          <wp:inline distT="0" distB="0" distL="0" distR="0">
+            <wp:extent cx="6047740" cy="4535805"/>
+            <wp:effectExtent l="0" t="0" r="0" b="0"/>
+            <wp:docPr id="17" name="Picture 17" descr=""/>
+            <wp:cNvGraphicFramePr/>
+            <a:graphic>
+              <a:graphicData uri="http://schemas.openxmlformats.org/drawingml/2006/picture">
+                <pic:pic>
+                  <pic:nvPicPr>
+                    <pic:cNvPr id="0" name="image22.png" descr=""/>
+                    <pic:cNvPicPr>
+                      <a:picLocks noChangeAspect="1" noChangeArrowheads="1"/>
+                    </pic:cNvPicPr>
+                  </pic:nvPicPr>
+                  <pic:blipFill>
+                    <a:blip r:embed="rId18"/>
+                    <a:stretch>
+                      <a:fillRect/>
+                    </a:stretch>
+                  </pic:blipFill>
+                  <pic:spPr bwMode="auto">
+                    <a:xfrm>
+                      <a:off x="0" y="0"/>
+                      <a:ext cx="6047740" cy="4535805"/>
+                    </a:xfrm>
+                    <a:prstGeom prst="rect">
+                      <a:avLst/>
+                    </a:prstGeom>
+                  </pic:spPr>
+                </pic:pic>
+              </a:graphicData>
+            </a:graphic>
+          </wp:inline>
+        </w:drawing>
+      </w:r>
+    </w:p>
+    <w:p>
+      <w:pPr>
+        <w:pStyle w:val="Normal"/>
+      </w:pPr>
+    </w:p>
+    <w:p>
+      <w:pPr>
+        <w:pStyle w:val="Normal"/>
+      </w:pPr>
+      <w:r>
+        <w:t xml:space="preserve">Ensuite, prennez la seconde option :</w:t>
+      </w:r>
+    </w:p>
+    <w:p>
+      <w:pPr>
+        <w:pStyle w:val="Normal"/>
+      </w:pPr>
+      <w:r>
+        <w:drawing>
+          <wp:inline distT="0" distB="0" distL="0" distR="0">
+            <wp:extent cx="6047740" cy="4535805"/>
+            <wp:effectExtent l="0" t="0" r="0" b="0"/>
+            <wp:docPr id="18" name="Picture 18" descr=""/>
+            <wp:cNvGraphicFramePr/>
+            <a:graphic>
+              <a:graphicData uri="http://schemas.openxmlformats.org/drawingml/2006/picture">
+                <pic:pic>
+                  <pic:nvPicPr>
+                    <pic:cNvPr id="0" name="image23.png" descr=""/>
+                    <pic:cNvPicPr>
+                      <a:picLocks noChangeAspect="1" noChangeArrowheads="1"/>
+                    </pic:cNvPicPr>
+                  </pic:nvPicPr>
+                  <pic:blipFill>
+                    <a:blip r:embed="rId19"/>
+                    <a:stretch>
+                      <a:fillRect/>
+                    </a:stretch>
+                  </pic:blipFill>
+                  <pic:spPr bwMode="auto">
+                    <a:xfrm>
+                      <a:off x="0" y="0"/>
+                      <a:ext cx="6047740" cy="4535805"/>
+                    </a:xfrm>
+                    <a:prstGeom prst="rect">
+                      <a:avLst/>
+                    </a:prstGeom>
+                  </pic:spPr>
+                </pic:pic>
+              </a:graphicData>
+            </a:graphic>
+          </wp:inline>
+        </w:drawing>
+      </w:r>
+    </w:p>
+    <w:p>
+      <w:pPr>
+        <w:pStyle w:val="Normal"/>
+      </w:pPr>
+    </w:p>
+    <w:p>
+      <w:pPr>
+        <w:pStyle w:val="Normal"/>
+      </w:pPr>
+      <w:r>
+        <w:t xml:space="preserve">Pour cette partie, nous avons besoin de récupérer l’adresse mac de nos vSwitches :</w:t>
+      </w:r>
+    </w:p>
+    <w:p>
+      <w:pPr>
+        <w:pStyle w:val="Normal"/>
+      </w:pPr>
+      <w:r>
+        <w:drawing>
+          <wp:inline distT="0" distB="0" distL="0" distR="0">
+            <wp:extent cx="6047740" cy="4535805"/>
+            <wp:effectExtent l="0" t="0" r="0" b="0"/>
+            <wp:docPr id="19" name="Picture 19" descr=""/>
+            <wp:cNvGraphicFramePr/>
+            <a:graphic>
+              <a:graphicData uri="http://schemas.openxmlformats.org/drawingml/2006/picture">
+                <pic:pic>
+                  <pic:nvPicPr>
+                    <pic:cNvPr id="0" name="image24.png" descr=""/>
+                    <pic:cNvPicPr>
+                      <a:picLocks noChangeAspect="1" noChangeArrowheads="1"/>
+                    </pic:cNvPicPr>
+                  </pic:nvPicPr>
+                  <pic:blipFill>
+                    <a:blip r:embed="rId20"/>
+                    <a:stretch>
+                      <a:fillRect/>
+                    </a:stretch>
+                  </pic:blipFill>
+                  <pic:spPr bwMode="auto">
+                    <a:xfrm>
+                      <a:off x="0" y="0"/>
+                      <a:ext cx="6047740" cy="4535805"/>
+                    </a:xfrm>
+                    <a:prstGeom prst="rect">
+                      <a:avLst/>
+                    </a:prstGeom>
+                  </pic:spPr>
+                </pic:pic>
+              </a:graphicData>
+            </a:graphic>
+          </wp:inline>
+        </w:drawing>
+      </w:r>
+    </w:p>
+    <w:p>
+      <w:pPr>
+        <w:pStyle w:val="Normal"/>
+      </w:pPr>
+    </w:p>
+    <w:p>
+      <w:pPr>
+        <w:pStyle w:val="Normal"/>
+      </w:pPr>
+      <w:r>
+        <w:t xml:space="preserve">Dans PowerShell Administrateur, exécutez :</w:t>
+      </w:r>
+    </w:p>
+    <w:tbl>
+      <w:tblPr>
+        <w:tblStyle w:val="TableGrid"/>
+        <w:tblW w:w="0" w:type="auto"/>
+        <w:tblLook w:val="04A0" w:firstRow="1" w:lastRow="0" w:firstColumn="1" w:lastColumn="0" w:noHBand="0" w:noVBand="1"/>
+      </w:tblPr>
+      <w:tblGrid>
+        <w:gridCol w:w="9524"/>
+      </w:tblGrid>
+      <w:tr>
+        <w:tc>
+          <w:tcPr>
+            <w:tcW w:w="9524" w:type="dxa"/>
+            <w:shd w:val="clear" w:color="auto" w:fill="000000"/>
+          </w:tcPr>
+          <w:p>
+            <w:r>
+              <w:rPr>
+                <w:rFonts w:ascii="Courier New" w:hAnsi="Courier New"/>
+                <w:color w:val="569CD6"/>
+                <w:sz w:val="21"/>
+              </w:rPr>
+              <w:t xml:space="preserve">Get</w:t>
+            </w:r>
+            <w:r>
+              <w:rPr>
+                <w:rFonts w:ascii="Courier New" w:hAnsi="Courier New"/>
+                <w:color w:val="D4D4D4"/>
+                <w:sz w:val="21"/>
+              </w:rPr>
+              <w:t xml:space="preserve">-VMNetworkAdapter -VMName </w:t>
+            </w:r>
+            <w:r>
+              <w:rPr>
+                <w:rFonts w:ascii="Courier New" w:hAnsi="Courier New"/>
+                <w:color w:val="CE9178"/>
+                <w:sz w:val="21"/>
+              </w:rPr>
+              <w:t xml:space="preserve">"ipfire"</w:t>
+            </w:r>
+            <w:r>
+              <w:rPr>
+                <w:rFonts w:ascii="Courier New" w:hAnsi="Courier New"/>
+                <w:color w:val="D4D4D4"/>
+                <w:sz w:val="21"/>
+              </w:rPr>
+              <w:t xml:space="preserve"> |</w:t>
+            </w:r>
+          </w:p>
+          <w:p>
+            <w:r>
+              <w:rPr>
+                <w:rFonts w:ascii="Courier New" w:hAnsi="Courier New"/>
+                <w:color w:val="D4D4D4"/>
+                <w:sz w:val="21"/>
+              </w:rPr>
+              <w:t xml:space="preserve">    </w:t>
+            </w:r>
+            <w:r>
+              <w:rPr>
+                <w:rFonts w:ascii="Courier New" w:hAnsi="Courier New"/>
+                <w:color w:val="569CD6"/>
+                <w:sz w:val="21"/>
+              </w:rPr>
+              <w:t xml:space="preserve">Select</w:t>
+            </w:r>
+            <w:r>
+              <w:rPr>
+                <w:rFonts w:ascii="Courier New" w:hAnsi="Courier New"/>
+                <w:color w:val="D4D4D4"/>
+                <w:sz w:val="21"/>
+              </w:rPr>
+              <w:t xml:space="preserve">-</w:t>
+            </w:r>
+            <w:r>
+              <w:rPr>
+                <w:rFonts w:ascii="Courier New" w:hAnsi="Courier New"/>
+                <w:color w:val="4EC9B0"/>
+                <w:sz w:val="21"/>
+              </w:rPr>
+              <w:t xml:space="preserve">Object</w:t>
+            </w:r>
+            <w:r>
+              <w:rPr>
+                <w:rFonts w:ascii="Courier New" w:hAnsi="Courier New"/>
+                <w:color w:val="D4D4D4"/>
+                <w:sz w:val="21"/>
+              </w:rPr>
+              <w:t xml:space="preserve"> Name, SwitchName, MacAddress</w:t>
+            </w:r>
+          </w:p>
+        </w:tc>
+      </w:tr>
+    </w:tbl>
+    <w:p>
+      <w:pPr>
+        <w:pStyle w:val="Normal"/>
+      </w:pPr>
+    </w:p>
+    <w:p>
+      <w:pPr>
+        <w:pStyle w:val="Normal"/>
+      </w:pPr>
+      <w:r>
+        <w:t xml:space="preserve">Vous devriez obtenir les adresses MAC de vos vSwitches par exemple pour ma VM :</w:t>
+      </w:r>
+    </w:p>
+    <w:tbl>
+      <w:tblPr>
+        <w:tblStyle w:val="TableGrid"/>
+        <w:tblW w:w="0" w:type="auto"/>
+        <w:tblLook w:val="04A0" w:firstRow="1" w:lastRow="0" w:firstColumn="1" w:lastColumn="0" w:noHBand="0" w:noVBand="1"/>
+      </w:tblPr>
+      <w:tblGrid>
+        <w:gridCol w:w="9524"/>
+      </w:tblGrid>
+      <w:tr>
+        <w:tc>
+          <w:tcPr>
+            <w:tcW w:w="9524" w:type="dxa"/>
+            <w:shd w:val="clear" w:color="auto" w:fill="000000"/>
+          </w:tcPr>
+          <w:p>
+            <w:pPr>
+              <w:rPr>
+                <w:rFonts w:ascii="Courier New" w:hAnsi="Courier New"/>
+                <w:color w:val="D4D4D4"/>
+                <w:sz w:val="21"/>
+              </w:rPr>
+            </w:pPr>
+            <w:r>
+              <w:rPr>
+                <w:rFonts w:ascii="Courier New" w:hAnsi="Courier New"/>
+                <w:color w:val="D4D4D4"/>
+                <w:sz w:val="21"/>
+              </w:rPr>
+              <w:t xml:space="preserve">Name            SwitchName MacAddress</w:t>
+            </w:r>
+          </w:p>
+          <w:p>
+            <w:r>
+              <w:rPr>
+                <w:rFonts w:ascii="Courier New" w:hAnsi="Courier New"/>
+                <w:i/>
+                <w:color w:val="6A9955"/>
+                <w:sz w:val="21"/>
+              </w:rPr>
+              <w:t xml:space="preserve">----            ---------- ----------</w:t>
+            </w:r>
+          </w:p>
+          <w:p>
+            <w:r>
+              <w:rPr>
+                <w:rFonts w:ascii="Courier New" w:hAnsi="Courier New"/>
+                <w:color w:val="D4D4D4"/>
+                <w:sz w:val="21"/>
+              </w:rPr>
+              <w:t xml:space="preserve">Network Adapter INTERNET   00155D00B728</w:t>
+            </w:r>
+          </w:p>
+          <w:p>
+            <w:r>
+              <w:rPr>
+                <w:rFonts w:ascii="Courier New" w:hAnsi="Courier New"/>
+                <w:color w:val="D4D4D4"/>
+                <w:sz w:val="21"/>
+              </w:rPr>
+              <w:t xml:space="preserve">KIFORMATOU      KIFORMATOU 00155D00B729</w:t>
+            </w:r>
+          </w:p>
+        </w:tc>
+      </w:tr>
+    </w:tbl>
+    <w:p>
+      <w:pPr>
+        <w:pStyle w:val="Normal"/>
+      </w:pPr>
+    </w:p>
+    <w:p>
+      <w:pPr>
+        <w:pStyle w:val="Normal"/>
+      </w:pPr>
+      <w:r>
+        <w:t xml:space="preserve">Rentrez ces informations sur chaque interface :</w:t>
+      </w:r>
+    </w:p>
+    <w:p>
+      <w:pPr>
+        <w:pStyle w:val="Normal"/>
+      </w:pPr>
+      <w:r>
+        <w:drawing>
+          <wp:inline distT="0" distB="0" distL="0" distR="0">
+            <wp:extent cx="6047740" cy="4535805"/>
+            <wp:effectExtent l="0" t="0" r="0" b="0"/>
+            <wp:docPr id="20" name="Picture 20" descr=""/>
+            <wp:cNvGraphicFramePr/>
+            <a:graphic>
+              <a:graphicData uri="http://schemas.openxmlformats.org/drawingml/2006/picture">
+                <pic:pic>
+                  <pic:nvPicPr>
+                    <pic:cNvPr id="0" name="image35.png" descr=""/>
+                    <pic:cNvPicPr>
+                      <a:picLocks noChangeAspect="1" noChangeArrowheads="1"/>
+                    </pic:cNvPicPr>
+                  </pic:nvPicPr>
+                  <pic:blipFill>
+                    <a:blip r:embed="rId21"/>
+                    <a:stretch>
+                      <a:fillRect/>
+                    </a:stretch>
+                  </pic:blipFill>
+                  <pic:spPr bwMode="auto">
+                    <a:xfrm>
+                      <a:off x="0" y="0"/>
+                      <a:ext cx="6047740" cy="4535805"/>
+                    </a:xfrm>
+                    <a:prstGeom prst="rect">
+                      <a:avLst/>
+                    </a:prstGeom>
+                  </pic:spPr>
+                </pic:pic>
+              </a:graphicData>
+            </a:graphic>
+          </wp:inline>
+        </w:drawing>
+      </w:r>
+    </w:p>
+    <w:p>
+      <w:pPr>
+        <w:pStyle w:val="Normal"/>
+      </w:pPr>
+    </w:p>
+    <w:p>
+      <w:pPr>
+        <w:pStyle w:val="Normal"/>
+      </w:pPr>
+      <w:r>
+        <w:t xml:space="preserve">Passons à la configuration réseau, choississez la dernière option :</w:t>
+      </w:r>
+    </w:p>
+    <w:p>
+      <w:pPr>
+        <w:pStyle w:val="Normal"/>
+      </w:pPr>
+      <w:r>
+        <w:drawing>
+          <wp:inline distT="0" distB="0" distL="0" distR="0">
+            <wp:extent cx="6047740" cy="4535805"/>
+            <wp:effectExtent l="0" t="0" r="0" b="0"/>
+            <wp:docPr id="21" name="Picture 21" descr=""/>
+            <wp:cNvGraphicFramePr/>
+            <a:graphic>
+              <a:graphicData uri="http://schemas.openxmlformats.org/drawingml/2006/picture">
+                <pic:pic>
+                  <pic:nvPicPr>
+                    <pic:cNvPr id="0" name="image26.png" descr=""/>
+                    <pic:cNvPicPr>
+                      <a:picLocks noChangeAspect="1" noChangeArrowheads="1"/>
+                    </pic:cNvPicPr>
+                  </pic:nvPicPr>
+                  <pic:blipFill>
+                    <a:blip r:embed="rId22"/>
+                    <a:stretch>
+                      <a:fillRect/>
+                    </a:stretch>
+                  </pic:blipFill>
+                  <pic:spPr bwMode="auto">
+                    <a:xfrm>
+                      <a:off x="0" y="0"/>
+                      <a:ext cx="6047740" cy="4535805"/>
+                    </a:xfrm>
+                    <a:prstGeom prst="rect">
+                      <a:avLst/>
+                    </a:prstGeom>
+                  </pic:spPr>
+                </pic:pic>
+              </a:graphicData>
+            </a:graphic>
+          </wp:inline>
+        </w:drawing>
+      </w:r>
+    </w:p>
+    <w:p>
+      <w:pPr>
+        <w:pStyle w:val="Normal"/>
+      </w:pPr>
+    </w:p>
+    <w:p>
+      <w:pPr>
+        <w:pStyle w:val="Normal"/>
+      </w:pPr>
+      <w:r>
+        <w:t xml:space="preserve">Configurez d’abord votre carte (GREEN) avec l’adresse </w:t>
+      </w:r>
+      <w:r>
+        <w:rPr>
+          <w:b/>
+          <w:bCs/>
+        </w:rPr>
+        <w:t xml:space="preserve">192.168.0.1/24 </w:t>
+      </w:r>
+      <w:r>
+        <w:t xml:space="preserve">:</w:t>
+      </w:r>
+    </w:p>
+    <w:p>
+      <w:pPr>
+        <w:pStyle w:val="Normal"/>
+      </w:pPr>
+      <w:r>
+        <w:drawing>
+          <wp:inline distT="0" distB="0" distL="0" distR="0">
+            <wp:extent cx="6047740" cy="4535805"/>
+            <wp:effectExtent l="0" t="0" r="0" b="0"/>
+            <wp:docPr id="22" name="Picture 22" descr=""/>
+            <wp:cNvGraphicFramePr/>
+            <a:graphic>
+              <a:graphicData uri="http://schemas.openxmlformats.org/drawingml/2006/picture">
+                <pic:pic>
+                  <pic:nvPicPr>
+                    <pic:cNvPr id="0" name="image27.png" descr=""/>
+                    <pic:cNvPicPr>
+                      <a:picLocks noChangeAspect="1" noChangeArrowheads="1"/>
+                    </pic:cNvPicPr>
+                  </pic:nvPicPr>
+                  <pic:blipFill>
+                    <a:blip r:embed="rId23"/>
+                    <a:stretch>
+                      <a:fillRect/>
+                    </a:stretch>
+                  </pic:blipFill>
+                  <pic:spPr bwMode="auto">
+                    <a:xfrm>
+                      <a:off x="0" y="0"/>
+                      <a:ext cx="6047740" cy="4535805"/>
+                    </a:xfrm>
+                    <a:prstGeom prst="rect">
+                      <a:avLst/>
+                    </a:prstGeom>
+                  </pic:spPr>
+                </pic:pic>
+              </a:graphicData>
+            </a:graphic>
+          </wp:inline>
+        </w:drawing>
+      </w:r>
+    </w:p>
+    <w:p>
+      <w:pPr>
+        <w:pStyle w:val="Normal"/>
+      </w:pPr>
+      <w:r>
+        <w:drawing>
+          <wp:inline distT="0" distB="0" distL="0" distR="0">
+            <wp:extent cx="6047740" cy="4535805"/>
+            <wp:effectExtent l="0" t="0" r="0" b="0"/>
+            <wp:docPr id="23" name="Picture 23" descr=""/>
+            <wp:cNvGraphicFramePr/>
+            <a:graphic>
+              <a:graphicData uri="http://schemas.openxmlformats.org/drawingml/2006/picture">
+                <pic:pic>
+                  <pic:nvPicPr>
+                    <pic:cNvPr id="0" name="image28.png" descr=""/>
+                    <pic:cNvPicPr>
+                      <a:picLocks noChangeAspect="1" noChangeArrowheads="1"/>
+                    </pic:cNvPicPr>
+                  </pic:nvPicPr>
+                  <pic:blipFill>
+                    <a:blip r:embed="rId24"/>
+                    <a:stretch>
+                      <a:fillRect/>
+                    </a:stretch>
+                  </pic:blipFill>
+                  <pic:spPr bwMode="auto">
+                    <a:xfrm>
+                      <a:off x="0" y="0"/>
+                      <a:ext cx="6047740" cy="4535805"/>
+                    </a:xfrm>
+                    <a:prstGeom prst="rect">
+                      <a:avLst/>
+                    </a:prstGeom>
+                  </pic:spPr>
+                </pic:pic>
+              </a:graphicData>
+            </a:graphic>
+          </wp:inline>
+        </w:drawing>
+      </w:r>
+    </w:p>
+    <w:p>
+      <w:pPr>
+        <w:pStyle w:val="Normal"/>
+      </w:pPr>
+      <w:r>
+        <w:drawing>
+          <wp:inline distT="0" distB="0" distL="0" distR="0">
+            <wp:extent cx="6047740" cy="4535805"/>
+            <wp:effectExtent l="0" t="0" r="0" b="0"/>
+            <wp:docPr id="24" name="Picture 24" descr=""/>
+            <wp:cNvGraphicFramePr/>
+            <a:graphic>
+              <a:graphicData uri="http://schemas.openxmlformats.org/drawingml/2006/picture">
+                <pic:pic>
+                  <pic:nvPicPr>
+                    <pic:cNvPr id="0" name="image29.png" descr=""/>
+                    <pic:cNvPicPr>
+                      <a:picLocks noChangeAspect="1" noChangeArrowheads="1"/>
+                    </pic:cNvPicPr>
+                  </pic:nvPicPr>
+                  <pic:blipFill>
+                    <a:blip r:embed="rId25"/>
+                    <a:stretch>
+                      <a:fillRect/>
+                    </a:stretch>
+                  </pic:blipFill>
+                  <pic:spPr bwMode="auto">
+                    <a:xfrm>
+                      <a:off x="0" y="0"/>
+                      <a:ext cx="6047740" cy="4535805"/>
+                    </a:xfrm>
+                    <a:prstGeom prst="rect">
+                      <a:avLst/>
+                    </a:prstGeom>
+                  </pic:spPr>
+                </pic:pic>
+              </a:graphicData>
+            </a:graphic>
+          </wp:inline>
+        </w:drawing>
+      </w:r>
+    </w:p>
+    <w:p>
+      <w:pPr>
+        <w:pStyle w:val="Normal"/>
+      </w:pPr>
+    </w:p>
+    <w:p>
+      <w:pPr>
+        <w:pStyle w:val="Normal"/>
+      </w:pPr>
+      <w:r>
+        <w:t xml:space="preserve">Puis configurez votre carte RED en DHCP :</w:t>
+      </w:r>
+    </w:p>
+    <w:p>
+      <w:pPr>
+        <w:pStyle w:val="Normal"/>
+      </w:pPr>
+      <w:r>
+        <w:drawing>
+          <wp:inline distT="0" distB="0" distL="0" distR="0">
+            <wp:extent cx="6047740" cy="4535805"/>
+            <wp:effectExtent l="0" t="0" r="0" b="0"/>
+            <wp:docPr id="25" name="Picture 25" descr=""/>
+            <wp:cNvGraphicFramePr/>
+            <a:graphic>
+              <a:graphicData uri="http://schemas.openxmlformats.org/drawingml/2006/picture">
+                <pic:pic>
+                  <pic:nvPicPr>
+                    <pic:cNvPr id="0" name="image30.png" descr=""/>
+                    <pic:cNvPicPr>
+                      <a:picLocks noChangeAspect="1" noChangeArrowheads="1"/>
+                    </pic:cNvPicPr>
+                  </pic:nvPicPr>
+                  <pic:blipFill>
+                    <a:blip r:embed="rId26"/>
+                    <a:stretch>
+                      <a:fillRect/>
+                    </a:stretch>
+                  </pic:blipFill>
+                  <pic:spPr bwMode="auto">
+                    <a:xfrm>
+                      <a:off x="0" y="0"/>
+                      <a:ext cx="6047740" cy="4535805"/>
+                    </a:xfrm>
+                    <a:prstGeom prst="rect">
+                      <a:avLst/>
+                    </a:prstGeom>
+                  </pic:spPr>
+                </pic:pic>
+              </a:graphicData>
+            </a:graphic>
+          </wp:inline>
+        </w:drawing>
+      </w:r>
+    </w:p>
+    <w:p>
+      <w:pPr>
+        <w:pStyle w:val="Normal"/>
+      </w:pPr>
+    </w:p>
+    <w:p>
+      <w:pPr>
+        <w:pStyle w:val="Normal"/>
+      </w:pPr>
+      <w:r>
+        <w:drawing>
+          <wp:inline distT="0" distB="0" distL="0" distR="0">
+            <wp:extent cx="6047740" cy="4535805"/>
+            <wp:effectExtent l="0" t="0" r="0" b="0"/>
+            <wp:docPr id="26" name="Picture 26" descr=""/>
+            <wp:cNvGraphicFramePr/>
+            <a:graphic>
+              <a:graphicData uri="http://schemas.openxmlformats.org/drawingml/2006/picture">
+                <pic:pic>
+                  <pic:nvPicPr>
+                    <pic:cNvPr id="0" name="image31.png" descr=""/>
+                    <pic:cNvPicPr>
+                      <a:picLocks noChangeAspect="1" noChangeArrowheads="1"/>
+                    </pic:cNvPicPr>
+                  </pic:nvPicPr>
+                  <pic:blipFill>
+                    <a:blip r:embed="rId27"/>
+                    <a:stretch>
+                      <a:fillRect/>
+                    </a:stretch>
+                  </pic:blipFill>
+                  <pic:spPr bwMode="auto">
+                    <a:xfrm>
+                      <a:off x="0" y="0"/>
+                      <a:ext cx="6047740" cy="4535805"/>
+                    </a:xfrm>
+                    <a:prstGeom prst="rect">
+                      <a:avLst/>
+                    </a:prstGeom>
+                  </pic:spPr>
+                </pic:pic>
+              </a:graphicData>
+            </a:graphic>
+          </wp:inline>
+        </w:drawing>
+      </w:r>
+    </w:p>
+    <w:p>
+      <w:pPr>
+        <w:pStyle w:val="Normal"/>
+      </w:pPr>
+    </w:p>
+    <w:p>
+      <w:pPr>
+        <w:pStyle w:val="Normal"/>
+      </w:pPr>
+      <w:r>
+        <w:t xml:space="preserve">Puis terminez la configuration réseau :</w:t>
+      </w:r>
+    </w:p>
+    <w:p>
+      <w:pPr>
+        <w:pStyle w:val="Normal"/>
+      </w:pPr>
+      <w:r>
+        <w:drawing>
+          <wp:inline distT="0" distB="0" distL="0" distR="0">
+            <wp:extent cx="6047740" cy="4535805"/>
+            <wp:effectExtent l="0" t="0" r="0" b="0"/>
+            <wp:docPr id="27" name="Picture 27" descr=""/>
+            <wp:cNvGraphicFramePr/>
+            <a:graphic>
+              <a:graphicData uri="http://schemas.openxmlformats.org/drawingml/2006/picture">
+                <pic:pic>
+                  <pic:nvPicPr>
+                    <pic:cNvPr id="0" name="image32.png" descr=""/>
+                    <pic:cNvPicPr>
+                      <a:picLocks noChangeAspect="1" noChangeArrowheads="1"/>
+                    </pic:cNvPicPr>
+                  </pic:nvPicPr>
+                  <pic:blipFill>
+                    <a:blip r:embed="rId28"/>
+                    <a:stretch>
+                      <a:fillRect/>
+                    </a:stretch>
+                  </pic:blipFill>
+                  <pic:spPr bwMode="auto">
+                    <a:xfrm>
+                      <a:off x="0" y="0"/>
+                      <a:ext cx="6047740" cy="4535805"/>
+                    </a:xfrm>
+                    <a:prstGeom prst="rect">
+                      <a:avLst/>
+                    </a:prstGeom>
+                  </pic:spPr>
+                </pic:pic>
+              </a:graphicData>
+            </a:graphic>
+          </wp:inline>
+        </w:drawing>
+      </w:r>
+    </w:p>
+    <w:p>
+      <w:pPr>
+        <w:pStyle w:val="Normal"/>
+      </w:pPr>
+    </w:p>
+    <w:p>
+      <w:pPr>
+        <w:pStyle w:val="Normal"/>
+      </w:pPr>
+      <w:r>
+        <w:t xml:space="preserve">Ignorez la configuration du serveur DHCP (nous le ferons plus tard) :</w:t>
+      </w:r>
+    </w:p>
+    <w:p>
+      <w:pPr>
+        <w:pStyle w:val="Normal"/>
+      </w:pPr>
+      <w:r>
+        <w:drawing>
+          <wp:inline distT="0" distB="0" distL="0" distR="0">
+            <wp:extent cx="6047740" cy="4535805"/>
+            <wp:effectExtent l="0" t="0" r="0" b="0"/>
+            <wp:docPr id="28" name="Picture 28" descr=""/>
+            <wp:cNvGraphicFramePr/>
+            <a:graphic>
+              <a:graphicData uri="http://schemas.openxmlformats.org/drawingml/2006/picture">
+                <pic:pic>
+                  <pic:nvPicPr>
+                    <pic:cNvPr id="0" name="image33.png" descr=""/>
+                    <pic:cNvPicPr>
+                      <a:picLocks noChangeAspect="1" noChangeArrowheads="1"/>
+                    </pic:cNvPicPr>
+                  </pic:nvPicPr>
+                  <pic:blipFill>
+                    <a:blip r:embed="rId29"/>
+                    <a:stretch>
+                      <a:fillRect/>
+                    </a:stretch>
+                  </pic:blipFill>
+                  <pic:spPr bwMode="auto">
+                    <a:xfrm>
+                      <a:off x="0" y="0"/>
+                      <a:ext cx="6047740" cy="4535805"/>
+                    </a:xfrm>
+                    <a:prstGeom prst="rect">
+                      <a:avLst/>
+                    </a:prstGeom>
+                  </pic:spPr>
+                </pic:pic>
+              </a:graphicData>
+            </a:graphic>
+          </wp:inline>
+        </w:drawing>
+      </w:r>
+    </w:p>
+    <w:p>
+      <w:pPr>
+        <w:pStyle w:val="Normal"/>
+      </w:pPr>
+      <w:r>
+        <w:t xml:space="preserve">Puis, terminez l’installation.</w:t>
+      </w:r>
+    </w:p>
+    <w:p>
+      <w:pPr>
+        <w:pStyle w:val="Normal"/>
+      </w:pPr>
+    </w:p>
+    <w:p>
+      <w:pPr>
+        <w:pStyle w:val="Normal"/>
+      </w:pPr>
+      <w:r>
+        <w:drawing>
+          <wp:inline distT="0" distB="0" distL="0" distR="0">
+            <wp:extent cx="6047740" cy="4535805"/>
+            <wp:effectExtent l="0" t="0" r="0" b="0"/>
+            <wp:docPr id="29" name="Picture 29" descr=""/>
+            <wp:cNvGraphicFramePr/>
+            <a:graphic>
+              <a:graphicData uri="http://schemas.openxmlformats.org/drawingml/2006/picture">
+                <pic:pic>
+                  <pic:nvPicPr>
+                    <pic:cNvPr id="0" name="image36.png" descr=""/>
+                    <pic:cNvPicPr>
+                      <a:picLocks noChangeAspect="1" noChangeArrowheads="1"/>
+                    </pic:cNvPicPr>
+                  </pic:nvPicPr>
+                  <pic:blipFill>
+                    <a:blip r:embed="rId30"/>
+                    <a:stretch>
+                      <a:fillRect/>
+                    </a:stretch>
+                  </pic:blipFill>
+                  <pic:spPr bwMode="auto">
+                    <a:xfrm>
+                      <a:off x="0" y="0"/>
+                      <a:ext cx="6047740" cy="4535805"/>
+                    </a:xfrm>
+                    <a:prstGeom prst="rect">
+                      <a:avLst/>
+                    </a:prstGeom>
+                  </pic:spPr>
+                </pic:pic>
+              </a:graphicData>
+            </a:graphic>
+          </wp:inline>
+        </w:drawing>
+      </w:r>
+    </w:p>
+    <w:p>
+      <w:pPr>
+        <w:pStyle w:val="Normal"/>
+      </w:pPr>
+      <w:r>
+        <w:br/>
+      </w:r>
+      <w:bookmarkStart w:id="9" w:name="_Toc000000030"/>
+    </w:p>
+    <w:p>
+      <w:pPr>
+        <w:pStyle w:val="Heading2"/>
+      </w:pPr>
+      <w:r>
+        <w:t xml:space="preserve">3. Configurer la VM</w:t>
+      </w:r>
+    </w:p>
+    <w:p>
+      <w:pPr>
+        <w:pStyle w:val="Normal"/>
+      </w:pPr>
+      <w:r>
+        <w:t xml:space="preserve">Après l’installation, entrez vos identifiants pour le root et vérifiez votre configuration IP avec </w:t>
+      </w:r>
+      <w:r>
+        <w:rPr>
+          <w:color w:val="FFFFFF"/>
+          <w:highlight w:val="black"/>
+        </w:rPr>
+        <w:t xml:space="preserve">ip add:</w:t>
+      </w:r>
+    </w:p>
+    <w:p>
+      <w:pPr>
+        <w:pStyle w:val="Normal"/>
+      </w:pPr>
+      <w:r>
+        <w:drawing>
+          <wp:inline distT="0" distB="0" distL="0" distR="0">
+            <wp:extent cx="6047740" cy="4535805"/>
+            <wp:effectExtent l="0" t="0" r="0" b="0"/>
+            <wp:docPr id="30" name="Picture 30" descr=""/>
+            <wp:cNvGraphicFramePr/>
+            <a:graphic>
+              <a:graphicData uri="http://schemas.openxmlformats.org/drawingml/2006/picture">
+                <pic:pic>
+                  <pic:nvPicPr>
+                    <pic:cNvPr id="0" name="image37.png" descr=""/>
+                    <pic:cNvPicPr>
+                      <a:picLocks noChangeAspect="1" noChangeArrowheads="1"/>
+                    </pic:cNvPicPr>
+                  </pic:nvPicPr>
+                  <pic:blipFill>
+                    <a:blip r:embed="rId31"/>
+                    <a:stretch>
+                      <a:fillRect/>
+                    </a:stretch>
+                  </pic:blipFill>
+                  <pic:spPr bwMode="auto">
+                    <a:xfrm>
+                      <a:off x="0" y="0"/>
+                      <a:ext cx="6047740" cy="4535805"/>
+                    </a:xfrm>
+                    <a:prstGeom prst="rect">
+                      <a:avLst/>
+                    </a:prstGeom>
+                  </pic:spPr>
+                </pic:pic>
+              </a:graphicData>
+            </a:graphic>
+          </wp:inline>
+        </w:drawing>
+      </w:r>
+    </w:p>
+    <w:p>
+      <w:pPr>
+        <w:pStyle w:val="Normal"/>
+      </w:pPr>
+    </w:p>
+    <w:p>
+      <w:pPr>
+        <w:pStyle w:val="Normal"/>
+      </w:pPr>
+      <w:r>
+        <w:t xml:space="preserve">Avant de se connectez à l’interface web de IPFire, configurez votre PC hôte avec</w:t>
+      </w:r>
+      <w:r>
+        <w:rPr>
+          <w:color w:val="FFFFFF"/>
+          <w:highlight w:val="black"/>
+        </w:rPr>
+        <w:t xml:space="preserve"> ncpa.cpl</w:t>
+      </w:r>
+      <w:r>
+        <w:t xml:space="preserve"> :</w:t>
+      </w:r>
+    </w:p>
+    <w:p>
+      <w:pPr>
+        <w:pStyle w:val="Normal"/>
+      </w:pPr>
+      <w:r>
+        <w:drawing>
+          <wp:inline distT="0" distB="0" distL="0" distR="0">
+            <wp:extent cx="6047740" cy="3607982"/>
+            <wp:effectExtent l="0" t="0" r="0" b="0"/>
+            <wp:docPr id="31" name="Picture 31" descr=""/>
+            <wp:cNvGraphicFramePr/>
+            <a:graphic>
+              <a:graphicData uri="http://schemas.openxmlformats.org/drawingml/2006/picture">
+                <pic:pic>
+                  <pic:nvPicPr>
+                    <pic:cNvPr id="0" name="image38.png" descr=""/>
+                    <pic:cNvPicPr>
+                      <a:picLocks noChangeAspect="1" noChangeArrowheads="1"/>
+                    </pic:cNvPicPr>
+                  </pic:nvPicPr>
+                  <pic:blipFill>
+                    <a:blip r:embed="rId32"/>
+                    <a:stretch>
+                      <a:fillRect/>
+                    </a:stretch>
+                  </pic:blipFill>
+                  <pic:spPr bwMode="auto">
+                    <a:xfrm>
+                      <a:off x="0" y="0"/>
+                      <a:ext cx="6047740" cy="3607982"/>
+                    </a:xfrm>
+                    <a:prstGeom prst="rect">
+                      <a:avLst/>
+                    </a:prstGeom>
+                  </pic:spPr>
+                </pic:pic>
+              </a:graphicData>
+            </a:graphic>
+          </wp:inline>
+        </w:drawing>
+      </w:r>
+    </w:p>
+    <w:p>
+      <w:pPr>
+        <w:pStyle w:val="Normal"/>
+      </w:pPr>
+    </w:p>
+    <w:p>
+      <w:pPr>
+        <w:pStyle w:val="Normal"/>
+      </w:pPr>
+      <w:r>
+        <w:t xml:space="preserve">Connectez-vous ensuite  à l’interface web en entrant dans un navigateur de votre choix l’adresse : </w:t>
+      </w:r>
+      <w:hyperlink r:id="rId33" w:history="1">
+        <w:r>
+          <w:rPr>
+            <w:rStyle w:val="Hyperlink"/>
+          </w:rPr>
+          <w:t xml:space="preserve">http://192.168.0.1:444</w:t>
+        </w:r>
+      </w:hyperlink>
+      <w:r>
+        <w:t xml:space="preserve">  </w:t>
+      </w:r>
+    </w:p>
+    <w:p>
+      <w:pPr>
+        <w:pStyle w:val="Normal"/>
+      </w:pPr>
+      <w:r>
+        <w:drawing>
+          <wp:inline distT="0" distB="0" distL="0" distR="0">
+            <wp:extent cx="6047740" cy="3400475"/>
+            <wp:effectExtent l="0" t="0" r="0" b="0"/>
+            <wp:docPr id="32" name="Picture 32" descr=""/>
+            <wp:cNvGraphicFramePr/>
+            <a:graphic>
+              <a:graphicData uri="http://schemas.openxmlformats.org/drawingml/2006/picture">
+                <pic:pic>
+                  <pic:nvPicPr>
+                    <pic:cNvPr id="0" name="image39.png" descr=""/>
+                    <pic:cNvPicPr>
+                      <a:picLocks noChangeAspect="1" noChangeArrowheads="1"/>
+                    </pic:cNvPicPr>
+                  </pic:nvPicPr>
+                  <pic:blipFill>
+                    <a:blip r:embed="rId34"/>
+                    <a:stretch>
+                      <a:fillRect/>
+                    </a:stretch>
+                  </pic:blipFill>
+                  <pic:spPr bwMode="auto">
+                    <a:xfrm>
+                      <a:off x="0" y="0"/>
+                      <a:ext cx="6047740" cy="3400475"/>
+                    </a:xfrm>
+                    <a:prstGeom prst="rect">
+                      <a:avLst/>
+                    </a:prstGeom>
+                  </pic:spPr>
+                </pic:pic>
+              </a:graphicData>
+            </a:graphic>
+          </wp:inline>
+        </w:drawing>
+      </w:r>
+    </w:p>
+    <w:p>
+      <w:pPr>
+        <w:pStyle w:val="Normal"/>
+      </w:pPr>
+    </w:p>
+    <w:p>
+      <w:pPr>
+        <w:pStyle w:val="Normal"/>
+      </w:pPr>
+      <w:r>
+        <w:t xml:space="preserve">Vous devriez tomber sur l’interface web suivant : </w:t>
+      </w:r>
+    </w:p>
+    <w:p>
+      <w:pPr>
+        <w:pStyle w:val="Normal"/>
+      </w:pPr>
+      <w:r>
+        <w:drawing>
+          <wp:inline distT="0" distB="0" distL="0" distR="0">
+            <wp:extent cx="6047740" cy="3401854"/>
+            <wp:effectExtent l="0" t="0" r="0" b="0"/>
+            <wp:docPr id="33" name="Picture 33" descr=""/>
+            <wp:cNvGraphicFramePr/>
+            <a:graphic>
+              <a:graphicData uri="http://schemas.openxmlformats.org/drawingml/2006/picture">
+                <pic:pic>
+                  <pic:nvPicPr>
+                    <pic:cNvPr id="0" name="image41.png" descr=""/>
+                    <pic:cNvPicPr>
+                      <a:picLocks noChangeAspect="1" noChangeArrowheads="1"/>
+                    </pic:cNvPicPr>
+                  </pic:nvPicPr>
+                  <pic:blipFill>
+                    <a:blip r:embed="rId35"/>
+                    <a:stretch>
+                      <a:fillRect/>
+                    </a:stretch>
+                  </pic:blipFill>
+                  <pic:spPr bwMode="auto">
+                    <a:xfrm>
+                      <a:off x="0" y="0"/>
+                      <a:ext cx="6047740" cy="3401854"/>
+                    </a:xfrm>
+                    <a:prstGeom prst="rect">
+                      <a:avLst/>
+                    </a:prstGeom>
+                  </pic:spPr>
+                </pic:pic>
+              </a:graphicData>
+            </a:graphic>
+          </wp:inline>
+        </w:drawing>
+      </w:r>
+    </w:p>
+    <w:p>
+      <w:pPr>
+        <w:pStyle w:val="Normal"/>
+      </w:pPr>
+    </w:p>
+    <w:p>
+      <w:pPr>
+        <w:pStyle w:val="Normal"/>
+      </w:pPr>
+      <w:r>
+        <w:t xml:space="preserve">Allez dans IPFire/Pakfire et mettez à jour le système  en cliquant sur </w:t>
+      </w:r>
+      <w:r>
+        <w:rPr>
+          <w:b/>
+          <w:bCs/>
+        </w:rPr>
+        <w:t xml:space="preserve">Refresh List</w:t>
+      </w:r>
+      <w:r>
+        <w:t xml:space="preserve"> : </w:t>
+      </w:r>
+    </w:p>
+    <w:p>
+      <w:pPr>
+        <w:pStyle w:val="Normal"/>
+      </w:pPr>
+      <w:r>
+        <w:drawing>
+          <wp:inline distT="0" distB="0" distL="0" distR="0">
+            <wp:extent cx="6047740" cy="3401854"/>
+            <wp:effectExtent l="0" t="0" r="0" b="0"/>
+            <wp:docPr id="34" name="Picture 34" descr=""/>
+            <wp:cNvGraphicFramePr/>
+            <a:graphic>
+              <a:graphicData uri="http://schemas.openxmlformats.org/drawingml/2006/picture">
+                <pic:pic>
+                  <pic:nvPicPr>
+                    <pic:cNvPr id="0" name="image42.png" descr=""/>
+                    <pic:cNvPicPr>
+                      <a:picLocks noChangeAspect="1" noChangeArrowheads="1"/>
+                    </pic:cNvPicPr>
+                  </pic:nvPicPr>
+                  <pic:blipFill>
+                    <a:blip r:embed="rId36"/>
+                    <a:stretch>
+                      <a:fillRect/>
+                    </a:stretch>
+                  </pic:blipFill>
+                  <pic:spPr bwMode="auto">
+                    <a:xfrm>
+                      <a:off x="0" y="0"/>
+                      <a:ext cx="6047740" cy="3401854"/>
+                    </a:xfrm>
+                    <a:prstGeom prst="rect">
+                      <a:avLst/>
+                    </a:prstGeom>
+                  </pic:spPr>
+                </pic:pic>
+              </a:graphicData>
+            </a:graphic>
+          </wp:inline>
+        </w:drawing>
+      </w:r>
+    </w:p>
+    <w:p>
+      <w:pPr>
+        <w:pStyle w:val="Normal"/>
+      </w:pPr>
+      <w:r>
+        <w:drawing>
+          <wp:inline distT="0" distB="0" distL="0" distR="0">
+            <wp:extent cx="6047740" cy="3401854"/>
+            <wp:effectExtent l="0" t="0" r="0" b="0"/>
+            <wp:docPr id="35" name="Picture 35" descr=""/>
+            <wp:cNvGraphicFramePr/>
+            <a:graphic>
+              <a:graphicData uri="http://schemas.openxmlformats.org/drawingml/2006/picture">
+                <pic:pic>
+                  <pic:nvPicPr>
+                    <pic:cNvPr id="0" name="image43.png" descr=""/>
+                    <pic:cNvPicPr>
+                      <a:picLocks noChangeAspect="1" noChangeArrowheads="1"/>
+                    </pic:cNvPicPr>
+                  </pic:nvPicPr>
+                  <pic:blipFill>
+                    <a:blip r:embed="rId37"/>
+                    <a:stretch>
+                      <a:fillRect/>
+                    </a:stretch>
+                  </pic:blipFill>
+                  <pic:spPr bwMode="auto">
+                    <a:xfrm>
+                      <a:off x="0" y="0"/>
+                      <a:ext cx="6047740" cy="3401854"/>
+                    </a:xfrm>
+                    <a:prstGeom prst="rect">
+                      <a:avLst/>
+                    </a:prstGeom>
+                  </pic:spPr>
+                </pic:pic>
+              </a:graphicData>
+            </a:graphic>
+          </wp:inline>
+        </w:drawing>
+      </w:r>
+    </w:p>
+    <w:p>
+      <w:pPr>
+        <w:pStyle w:val="Normal"/>
+      </w:pPr>
+    </w:p>
+    <w:p>
+      <w:pPr>
+        <w:pStyle w:val="Heading1"/>
+      </w:pPr>
+      <w:bookmarkStart w:id="10" w:name="_Toc000000021"/>
+      <w:bookmarkStart w:id="11" w:name="azure_section_21"/>
       <w:r>
         <w:t xml:space="preserve">6.  Support et références</w:t>
       </w:r>
-      <w:bookmarkEnd w:id="15"/>
-      <w:bookmarkEnd w:id="14"/>
+      <w:bookmarkEnd w:id="11"/>
+      <w:bookmarkEnd w:id="10"/>
     </w:p>
     <w:p>
       <w:pPr>
         <w:pStyle w:val="Heading2"/>
       </w:pPr>
-      <w:bookmarkStart w:id="16" w:name="_Toc000000031"/>
+      <w:bookmarkStart w:id="12" w:name="_Toc000000031"/>
       <w:r>
         <w:t xml:space="preserve">6.1. </w:t>
       </w:r>
-      <w:bookmarkStart w:id="17" w:name="_Toc000000023"/>
-      <w:bookmarkStart w:id="18" w:name="azure_section_23"/>
+      <w:bookmarkStart w:id="13" w:name="_Toc000000023"/>
+      <w:bookmarkStart w:id="14" w:name="azure_section_23"/>
       <w:r>
         <w:t xml:space="preserve">Diagnostic et support</w:t>
       </w:r>
-      <w:bookmarkEnd w:id="18"/>
-      <w:bookmarkEnd w:id="17"/>
-      <w:bookmarkEnd w:id="16"/>
+      <w:bookmarkEnd w:id="14"/>
+      <w:bookmarkEnd w:id="13"/>
+      <w:bookmarkEnd w:id="12"/>
     </w:p>
     <w:p>
       <w:r>
@@ -1164,11 +4668,11 @@
       <w:pPr>
         <w:pStyle w:val="Heading2"/>
       </w:pPr>
-      <w:bookmarkStart w:id="19" w:name="_Toc000000032"/>
+      <w:bookmarkStart w:id="15" w:name="_Toc000000032"/>
       <w:r>
         <w:t xml:space="preserve">6.2. Glossaire</w:t>
       </w:r>
-      <w:bookmarkEnd w:id="19"/>
+      <w:bookmarkEnd w:id="15"/>
     </w:p>
     <w:p>
       <w:pPr>
@@ -1218,16 +4722,16 @@
       <w:pPr>
         <w:pStyle w:val="Heading2"/>
       </w:pPr>
-      <w:bookmarkStart w:id="20" w:name="_Toc000000033"/>
+      <w:bookmarkStart w:id="16" w:name="_Toc000000033"/>
       <w:r>
         <w:t xml:space="preserve">6.3. </w:t>
       </w:r>
-      <w:bookmarkStart w:id="21" w:name="_Toc000000024"/>
-      <w:bookmarkStart w:id="22" w:name="azure_section_24"/>
+      <w:bookmarkStart w:id="17" w:name="_Toc000000024"/>
+      <w:bookmarkStart w:id="18" w:name="azure_section_24"/>
       <w:r>
         <w:t xml:space="preserve">Références</w:t>
       </w:r>
-      <w:bookmarkEnd w:id="20"/>
+      <w:bookmarkEnd w:id="16"/>
     </w:p>
     <w:p>
       <w:pPr>
@@ -1237,10 +4741,7 @@
         <w:rPr>
           <w:b/>
         </w:rPr>
-        <w:t xml:space="preserve">Documentations  </w:t>
-      </w:r>
-      <w:r>
-        <w:t xml:space="preserve">: </w:t>
+        <w:t xml:space="preserve">Documentations</w:t>
       </w:r>
     </w:p>
     <w:p>
@@ -1251,7 +4752,7 @@
           <w:numId w:val="10"/>
         </w:numPr>
       </w:pPr>
-      <w:hyperlink r:id="rId4" w:history="1">
+      <w:hyperlink r:id="rId38" w:history="1">
         <w:r>
           <w:rPr>
             <w:rStyle w:val="Hyperlink"/>
@@ -1284,6 +4785,23 @@
           <w:numId w:val="10"/>
         </w:numPr>
       </w:pPr>
+      <w:hyperlink r:id="rId39" w:history="1">
+        <w:r>
+          <w:rPr>
+            <w:rStyle w:val="Hyperlink"/>
+          </w:rPr>
+          <w:t xml:space="preserve">Microsoft. Get-VMSwitch. 2026.</w:t>
+        </w:r>
+      </w:hyperlink>
+    </w:p>
+    <w:p>
+      <w:pPr>
+        <w:pStyle w:val="ListParagraph"/>
+        <w:numPr>
+          <w:ilvl w:val="0"/>
+          <w:numId w:val="10"/>
+        </w:numPr>
+      </w:pPr>
       <w:r>
         <w:t xml:space="preserve">Deciso. Virtual &amp; Cloud-Based Installation. 2026.</w:t>
       </w:r>
@@ -1296,7 +4814,7 @@
           <w:numId w:val="10"/>
         </w:numPr>
       </w:pPr>
-      <w:hyperlink r:id="rId5" w:history="1">
+      <w:hyperlink r:id="rId40" w:history="1">
         <w:r>
           <w:rPr>
             <w:rStyle w:val="Hyperlink"/>
@@ -1313,7 +4831,7 @@
           <w:numId w:val="10"/>
         </w:numPr>
       </w:pPr>
-      <w:hyperlink r:id="rId6" w:history="1">
+      <w:hyperlink r:id="rId41" w:history="1">
         <w:r>
           <w:rPr>
             <w:rStyle w:val="Hyperlink"/>
@@ -1354,8 +4872,8 @@
       </w:r>
     </w:p>
     <w:sectPr>
-      <w:headerReference w:type="default" r:id="rId7"/>
-      <w:footerReference w:type="default" r:id="rId8"/>
+      <w:headerReference w:type="default" r:id="rId42"/>
+      <w:footerReference w:type="default" r:id="rId43"/>
       <w:type w:val="nextPage"/>
       <w:pgSz w:w="11906" w:h="16838"/>
       <w:pgMar w:top="1134" w:right="1191" w:bottom="1020" w:left="1191" w:header="454" w:footer="454" w:gutter="0"/>
@@ -1419,7 +4937,7 @@
           <wp:extent cx="2088000" cy="2088000"/>
           <wp:effectExtent l="0" t="0" r="0" b="0"/>
           <wp:wrapNone/>
-          <wp:docPr id="3" name="Picture 3" descr="Motif graphique décoratif en bleu tech"/>
+          <wp:docPr id="36" name="Picture 36" descr="Motif graphique décoratif en bleu tech"/>
           <wp:cNvGraphicFramePr/>
           <a:graphic>
             <a:graphicData uri="http://schemas.openxmlformats.org/drawingml/2006/picture">
@@ -13285,6 +16803,480 @@
       <w:sz w:val="21"/>
     </w:rPr>
   </w:style>
+  <w:style w:type="character" w:styleId="Hyperlink">
+    <w:name w:val="Hyperlink"/>
+    <w:basedOn w:val="DefaultParagraphFont"/>
+    <w:uiPriority w:val="99"/>
+    <w:rPr>
+      <w:color w:val="467886"/>
+      <w:u w:val="single"/>
+    </w:rPr>
+  </w:style>
+  <w:style w:type="paragraph" w:styleId="FootnoteText">
+    <w:name w:val="footnote text"/>
+    <w:basedOn w:val="Normal"/>
+    <w:uiPriority w:val="99"/>
+    <w:pPr>
+      <w:spacing w:after="0" w:line="240" w:lineRule="auto"/>
+    </w:pPr>
+    <w:rPr>
+      <w:sz w:val="20"/>
+    </w:rPr>
+  </w:style>
+  <w:style w:type="character" w:styleId="FootnoteReference">
+    <w:name w:val="footnote reference"/>
+    <w:basedOn w:val="DefaultParagraphFont"/>
+    <w:uiPriority w:val="99"/>
+    <w:rPr>
+      <w:vertAlign w:val="superscript"/>
+    </w:rPr>
+  </w:style>
+  <w:style w:type="paragraph" w:styleId="EndnoteText">
+    <w:name w:val="endnote text"/>
+    <w:basedOn w:val="Normal"/>
+    <w:uiPriority w:val="99"/>
+    <w:pPr>
+      <w:spacing w:after="0" w:line="240" w:lineRule="auto"/>
+    </w:pPr>
+    <w:rPr>
+      <w:sz w:val="20"/>
+    </w:rPr>
+  </w:style>
+  <w:style w:type="character" w:styleId="EndnoteReference">
+    <w:name w:val="endnote reference"/>
+    <w:basedOn w:val="DefaultParagraphFont"/>
+    <w:uiPriority w:val="99"/>
+    <w:rPr>
+      <w:vertAlign w:val="superscript"/>
+    </w:rPr>
+  </w:style>
+  <w:style w:type="paragraph" w:styleId="TOC3">
+    <w:name w:val="toc 3"/>
+    <w:basedOn w:val="Normal"/>
+    <w:next w:val="Normal"/>
+    <w:uiPriority w:val="39"/>
+    <w:pPr>
+      <w:spacing w:after="100"/>
+      <w:ind w:left="480"/>
+    </w:pPr>
+  </w:style>
+  <w:style w:type="paragraph" w:styleId="TOC4">
+    <w:name w:val="toc 4"/>
+    <w:basedOn w:val="Normal"/>
+    <w:next w:val="Normal"/>
+    <w:uiPriority w:val="39"/>
+    <w:pPr>
+      <w:spacing w:after="100"/>
+      <w:ind w:left="720"/>
+    </w:pPr>
+  </w:style>
+  <w:style w:type="paragraph" w:styleId="TOC5">
+    <w:name w:val="toc 5"/>
+    <w:basedOn w:val="Normal"/>
+    <w:next w:val="Normal"/>
+    <w:uiPriority w:val="39"/>
+    <w:pPr>
+      <w:spacing w:after="100"/>
+      <w:ind w:left="960"/>
+    </w:pPr>
+  </w:style>
+  <w:style w:type="paragraph" w:styleId="TOC6">
+    <w:name w:val="toc 6"/>
+    <w:basedOn w:val="Normal"/>
+    <w:next w:val="Normal"/>
+    <w:uiPriority w:val="39"/>
+    <w:pPr>
+      <w:spacing w:after="100"/>
+      <w:ind w:left="1200"/>
+    </w:pPr>
+  </w:style>
+  <w:style w:type="paragraph" w:styleId="TOC7">
+    <w:name w:val="toc 7"/>
+    <w:basedOn w:val="Normal"/>
+    <w:next w:val="Normal"/>
+    <w:uiPriority w:val="39"/>
+    <w:pPr>
+      <w:spacing w:after="100"/>
+      <w:ind w:left="1440"/>
+    </w:pPr>
+  </w:style>
+  <w:style w:type="paragraph" w:styleId="TOC8">
+    <w:name w:val="toc 8"/>
+    <w:basedOn w:val="Normal"/>
+    <w:next w:val="Normal"/>
+    <w:uiPriority w:val="39"/>
+    <w:pPr>
+      <w:spacing w:after="100"/>
+      <w:ind w:left="1680"/>
+    </w:pPr>
+  </w:style>
+  <w:style w:type="paragraph" w:styleId="TOC9">
+    <w:name w:val="toc 9"/>
+    <w:basedOn w:val="Normal"/>
+    <w:next w:val="Normal"/>
+    <w:uiPriority w:val="39"/>
+    <w:pPr>
+      <w:spacing w:after="100"/>
+      <w:ind w:left="1920"/>
+    </w:pPr>
+  </w:style>
+  <w:style w:type="table" w:styleId="PlainTable1">
+    <w:name w:val="Plain Table 1"/>
+    <w:basedOn w:val="TableNormal"/>
+    <w:uiPriority w:val="60"/>
+    <w:pPr>
+      <w:spacing w:after="0" w:line="240" w:lineRule="auto"/>
+    </w:pPr>
+    <w:tblPr>
+      <w:tblStyleRowBandSize w:val="1"/>
+      <w:tblStyleColBandSize w:val="1"/>
+      <w:tblBorders>
+        <w:top w:val="single" w:sz="4" w:space="0" w:color="BFBFBF"/>
+        <w:left w:val="single" w:sz="4" w:space="0" w:color="BFBFBF"/>
+        <w:bottom w:val="single" w:sz="4" w:space="0" w:color="BFBFBF"/>
+        <w:right w:val="single" w:sz="4" w:space="0" w:color="BFBFBF"/>
+        <w:insideH w:val="single" w:sz="4" w:space="0" w:color="BFBFBF"/>
+        <w:insideV w:val="single" w:sz="4" w:space="0" w:color="BFBFBF"/>
+      </w:tblBorders>
+    </w:tblPr>
+    <w:tblStylePr w:type="band1Horz">
+      <w:tcPr>
+        <w:shd w:val="clear" w:color="auto" w:fill="F2F2F2"/>
+      </w:tcPr>
+    </w:tblStylePr>
+    <w:tblStylePr w:type="firstCol">
+      <w:rPr>
+        <w:b/>
+      </w:rPr>
+    </w:tblStylePr>
+    <w:tblStylePr w:type="firstRow">
+      <w:rPr>
+        <w:b/>
+      </w:rPr>
+    </w:tblStylePr>
+  </w:style>
+  <w:style w:type="table" w:styleId="GridTable1Light">
+    <w:name w:val="Grid Table 1 Light"/>
+    <w:basedOn w:val="TableNormal"/>
+    <w:uiPriority w:val="60"/>
+    <w:pPr>
+      <w:spacing w:after="0" w:line="240" w:lineRule="auto"/>
+    </w:pPr>
+    <w:tblPr>
+      <w:tblStyleRowBandSize w:val="1"/>
+      <w:tblStyleColBandSize w:val="1"/>
+      <w:tblBorders>
+        <w:top w:val="single" w:sz="4" w:space="0" w:color="999999"/>
+        <w:left w:val="single" w:sz="4" w:space="0" w:color="999999"/>
+        <w:bottom w:val="single" w:sz="4" w:space="0" w:color="999999"/>
+        <w:right w:val="single" w:sz="4" w:space="0" w:color="999999"/>
+        <w:insideH w:val="single" w:sz="4" w:space="0" w:color="999999"/>
+        <w:insideV w:val="single" w:sz="4" w:space="0" w:color="999999"/>
+      </w:tblBorders>
+    </w:tblPr>
+    <w:tblStylePr w:type="firstCol">
+      <w:rPr>
+        <w:b/>
+      </w:rPr>
+    </w:tblStylePr>
+    <w:tblStylePr w:type="firstRow">
+      <w:rPr>
+        <w:b/>
+      </w:rPr>
+    </w:tblStylePr>
+  </w:style>
+  <w:style w:type="table" w:styleId="GridTable4AccentBlue">
+    <w:name w:val="Grid Table 4 – Blue"/>
+    <w:basedOn w:val="TableNormal"/>
+    <w:uiPriority w:val="60"/>
+    <w:pPr>
+      <w:spacing w:after="0" w:line="240" w:lineRule="auto"/>
+    </w:pPr>
+    <w:tblPr>
+      <w:tblStyleRowBandSize w:val="1"/>
+      <w:tblStyleColBandSize w:val="1"/>
+      <w:tblBorders>
+        <w:top w:val="single" w:sz="4" w:space="0" w:color="C1E4F5"/>
+        <w:left w:val="single" w:sz="4" w:space="0" w:color="C1E4F5"/>
+        <w:bottom w:val="single" w:sz="4" w:space="0" w:color="C1E4F5"/>
+        <w:right w:val="single" w:sz="4" w:space="0" w:color="C1E4F5"/>
+        <w:insideH w:val="single" w:sz="4" w:space="0" w:color="C1E4F5"/>
+        <w:insideV w:val="single" w:sz="4" w:space="0" w:color="C1E4F5"/>
+      </w:tblBorders>
+    </w:tblPr>
+    <w:tblStylePr w:type="band1Horz">
+      <w:tcPr>
+        <w:shd w:val="clear" w:color="auto" w:fill="C1E4F5"/>
+      </w:tcPr>
+    </w:tblStylePr>
+    <w:tblStylePr w:type="firstCol">
+      <w:rPr>
+        <w:b/>
+      </w:rPr>
+    </w:tblStylePr>
+    <w:tblStylePr w:type="firstRow">
+      <w:rPr>
+        <w:b/>
+        <w:color w:val="FFFFFF"/>
+      </w:rPr>
+      <w:tcPr>
+        <w:shd w:val="clear" w:color="auto" w:fill="156082"/>
+      </w:tcPr>
+    </w:tblStylePr>
+  </w:style>
+  <w:style w:type="table" w:styleId="ListTable3AccentBlue">
+    <w:name w:val="List Table 3 – Blue"/>
+    <w:basedOn w:val="TableNormal"/>
+    <w:uiPriority w:val="60"/>
+    <w:pPr>
+      <w:spacing w:after="0" w:line="240" w:lineRule="auto"/>
+    </w:pPr>
+    <w:tblPr>
+      <w:tblStyleRowBandSize w:val="1"/>
+      <w:tblStyleColBandSize w:val="1"/>
+      <w:tblBorders>
+        <w:top w:val="single" w:sz="4" w:space="0" w:color="156082"/>
+        <w:left w:val="single" w:sz="4" w:space="0" w:color="156082"/>
+        <w:bottom w:val="single" w:sz="4" w:space="0" w:color="156082"/>
+        <w:right w:val="single" w:sz="4" w:space="0" w:color="156082"/>
+      </w:tblBorders>
+    </w:tblPr>
+    <w:tblStylePr w:type="firstRow">
+      <w:rPr>
+        <w:b/>
+        <w:color w:val="FFFFFF"/>
+      </w:rPr>
+      <w:tcPr>
+        <w:shd w:val="clear" w:color="auto" w:fill="156082"/>
+      </w:tcPr>
+    </w:tblStylePr>
+    <w:tblStylePr w:type="lastRow">
+      <w:tcPr>
+        <w:tcBorders>
+          <w:top w:val="single" w:sz="4" w:space="0" w:color="156082"/>
+        </w:tcBorders>
+      </w:tcPr>
+    </w:tblStylePr>
+  </w:style>
+  <w:style w:type="table" w:styleId="GridTable4AccentOrange">
+    <w:name w:val="Grid Table 4 – Orange"/>
+    <w:basedOn w:val="TableNormal"/>
+    <w:uiPriority w:val="60"/>
+    <w:pPr>
+      <w:spacing w:after="0" w:line="240" w:lineRule="auto"/>
+    </w:pPr>
+    <w:tblPr>
+      <w:tblStyleRowBandSize w:val="1"/>
+      <w:tblStyleColBandSize w:val="1"/>
+      <w:tblBorders>
+        <w:top w:val="single" w:sz="4" w:space="0" w:color="FBE2D5"/>
+        <w:left w:val="single" w:sz="4" w:space="0" w:color="FBE2D5"/>
+        <w:bottom w:val="single" w:sz="4" w:space="0" w:color="FBE2D5"/>
+        <w:right w:val="single" w:sz="4" w:space="0" w:color="FBE2D5"/>
+        <w:insideH w:val="single" w:sz="4" w:space="0" w:color="FBE2D5"/>
+        <w:insideV w:val="single" w:sz="4" w:space="0" w:color="FBE2D5"/>
+      </w:tblBorders>
+    </w:tblPr>
+    <w:tblStylePr w:type="band1Horz">
+      <w:tcPr>
+        <w:shd w:val="clear" w:color="auto" w:fill="FBE2D5"/>
+      </w:tcPr>
+    </w:tblStylePr>
+    <w:tblStylePr w:type="firstCol">
+      <w:rPr>
+        <w:b/>
+      </w:rPr>
+    </w:tblStylePr>
+    <w:tblStylePr w:type="firstRow">
+      <w:rPr>
+        <w:b/>
+        <w:color w:val="FFFFFF"/>
+      </w:rPr>
+      <w:tcPr>
+        <w:shd w:val="clear" w:color="auto" w:fill="E97132"/>
+      </w:tcPr>
+    </w:tblStylePr>
+  </w:style>
+  <w:style w:type="table" w:styleId="ListTable3AccentOrange">
+    <w:name w:val="List Table 3 – Orange"/>
+    <w:basedOn w:val="TableNormal"/>
+    <w:uiPriority w:val="60"/>
+    <w:pPr>
+      <w:spacing w:after="0" w:line="240" w:lineRule="auto"/>
+    </w:pPr>
+    <w:tblPr>
+      <w:tblStyleRowBandSize w:val="1"/>
+      <w:tblStyleColBandSize w:val="1"/>
+      <w:tblBorders>
+        <w:top w:val="single" w:sz="4" w:space="0" w:color="E97132"/>
+        <w:left w:val="single" w:sz="4" w:space="0" w:color="E97132"/>
+        <w:bottom w:val="single" w:sz="4" w:space="0" w:color="E97132"/>
+        <w:right w:val="single" w:sz="4" w:space="0" w:color="E97132"/>
+      </w:tblBorders>
+    </w:tblPr>
+    <w:tblStylePr w:type="firstRow">
+      <w:rPr>
+        <w:b/>
+        <w:color w:val="FFFFFF"/>
+      </w:rPr>
+      <w:tcPr>
+        <w:shd w:val="clear" w:color="auto" w:fill="E97132"/>
+      </w:tcPr>
+    </w:tblStylePr>
+    <w:tblStylePr w:type="lastRow">
+      <w:tcPr>
+        <w:tcBorders>
+          <w:top w:val="single" w:sz="4" w:space="0" w:color="E97132"/>
+        </w:tcBorders>
+      </w:tcPr>
+    </w:tblStylePr>
+  </w:style>
+  <w:style w:type="table" w:styleId="GridTable4AccentGreen">
+    <w:name w:val="Grid Table 4 – Green"/>
+    <w:basedOn w:val="TableNormal"/>
+    <w:uiPriority w:val="60"/>
+    <w:pPr>
+      <w:spacing w:after="0" w:line="240" w:lineRule="auto"/>
+    </w:pPr>
+    <w:tblPr>
+      <w:tblStyleRowBandSize w:val="1"/>
+      <w:tblStyleColBandSize w:val="1"/>
+      <w:tblBorders>
+        <w:top w:val="single" w:sz="4" w:space="0" w:color="C1F0C8"/>
+        <w:left w:val="single" w:sz="4" w:space="0" w:color="C1F0C8"/>
+        <w:bottom w:val="single" w:sz="4" w:space="0" w:color="C1F0C8"/>
+        <w:right w:val="single" w:sz="4" w:space="0" w:color="C1F0C8"/>
+        <w:insideH w:val="single" w:sz="4" w:space="0" w:color="C1F0C8"/>
+        <w:insideV w:val="single" w:sz="4" w:space="0" w:color="C1F0C8"/>
+      </w:tblBorders>
+    </w:tblPr>
+    <w:tblStylePr w:type="band1Horz">
+      <w:tcPr>
+        <w:shd w:val="clear" w:color="auto" w:fill="C1F0C8"/>
+      </w:tcPr>
+    </w:tblStylePr>
+    <w:tblStylePr w:type="firstCol">
+      <w:rPr>
+        <w:b/>
+      </w:rPr>
+    </w:tblStylePr>
+    <w:tblStylePr w:type="firstRow">
+      <w:rPr>
+        <w:b/>
+        <w:color w:val="FFFFFF"/>
+      </w:rPr>
+      <w:tcPr>
+        <w:shd w:val="clear" w:color="auto" w:fill="196B24"/>
+      </w:tcPr>
+    </w:tblStylePr>
+  </w:style>
+  <w:style w:type="table" w:styleId="ListTable3AccentGreen">
+    <w:name w:val="List Table 3 – Green"/>
+    <w:basedOn w:val="TableNormal"/>
+    <w:uiPriority w:val="60"/>
+    <w:pPr>
+      <w:spacing w:after="0" w:line="240" w:lineRule="auto"/>
+    </w:pPr>
+    <w:tblPr>
+      <w:tblStyleRowBandSize w:val="1"/>
+      <w:tblStyleColBandSize w:val="1"/>
+      <w:tblBorders>
+        <w:top w:val="single" w:sz="4" w:space="0" w:color="196B24"/>
+        <w:left w:val="single" w:sz="4" w:space="0" w:color="196B24"/>
+        <w:bottom w:val="single" w:sz="4" w:space="0" w:color="196B24"/>
+        <w:right w:val="single" w:sz="4" w:space="0" w:color="196B24"/>
+      </w:tblBorders>
+    </w:tblPr>
+    <w:tblStylePr w:type="firstRow">
+      <w:rPr>
+        <w:b/>
+        <w:color w:val="FFFFFF"/>
+      </w:rPr>
+      <w:tcPr>
+        <w:shd w:val="clear" w:color="auto" w:fill="196B24"/>
+      </w:tcPr>
+    </w:tblStylePr>
+    <w:tblStylePr w:type="lastRow">
+      <w:tcPr>
+        <w:tcBorders>
+          <w:top w:val="single" w:sz="4" w:space="0" w:color="196B24"/>
+        </w:tcBorders>
+      </w:tcPr>
+    </w:tblStylePr>
+  </w:style>
+  <w:style w:type="table" w:styleId="GridTable4AccentPurple">
+    <w:name w:val="Grid Table 4 – Purple"/>
+    <w:basedOn w:val="TableNormal"/>
+    <w:uiPriority w:val="60"/>
+    <w:pPr>
+      <w:spacing w:after="0" w:line="240" w:lineRule="auto"/>
+    </w:pPr>
+    <w:tblPr>
+      <w:tblStyleRowBandSize w:val="1"/>
+      <w:tblStyleColBandSize w:val="1"/>
+      <w:tblBorders>
+        <w:top w:val="single" w:sz="4" w:space="0" w:color="E5D2EE"/>
+        <w:left w:val="single" w:sz="4" w:space="0" w:color="E5D2EE"/>
+        <w:bottom w:val="single" w:sz="4" w:space="0" w:color="E5D2EE"/>
+        <w:right w:val="single" w:sz="4" w:space="0" w:color="E5D2EE"/>
+        <w:insideH w:val="single" w:sz="4" w:space="0" w:color="E5D2EE"/>
+        <w:insideV w:val="single" w:sz="4" w:space="0" w:color="E5D2EE"/>
+      </w:tblBorders>
+    </w:tblPr>
+    <w:tblStylePr w:type="band1Horz">
+      <w:tcPr>
+        <w:shd w:val="clear" w:color="auto" w:fill="E5D2EE"/>
+      </w:tcPr>
+    </w:tblStylePr>
+    <w:tblStylePr w:type="firstCol">
+      <w:rPr>
+        <w:b/>
+      </w:rPr>
+    </w:tblStylePr>
+    <w:tblStylePr w:type="firstRow">
+      <w:rPr>
+        <w:b/>
+        <w:color w:val="FFFFFF"/>
+      </w:rPr>
+      <w:tcPr>
+        <w:shd w:val="clear" w:color="auto" w:fill="712E8D"/>
+      </w:tcPr>
+    </w:tblStylePr>
+  </w:style>
+  <w:style w:type="table" w:styleId="ListTable3AccentPurple">
+    <w:name w:val="List Table 3 – Purple"/>
+    <w:basedOn w:val="TableNormal"/>
+    <w:uiPriority w:val="60"/>
+    <w:pPr>
+      <w:spacing w:after="0" w:line="240" w:lineRule="auto"/>
+    </w:pPr>
+    <w:tblPr>
+      <w:tblStyleRowBandSize w:val="1"/>
+      <w:tblStyleColBandSize w:val="1"/>
+      <w:tblBorders>
+        <w:top w:val="single" w:sz="4" w:space="0" w:color="712E8D"/>
+        <w:left w:val="single" w:sz="4" w:space="0" w:color="712E8D"/>
+        <w:bottom w:val="single" w:sz="4" w:space="0" w:color="712E8D"/>
+        <w:right w:val="single" w:sz="4" w:space="0" w:color="712E8D"/>
+      </w:tblBorders>
+    </w:tblPr>
+    <w:tblStylePr w:type="firstRow">
+      <w:rPr>
+        <w:b/>
+        <w:color w:val="FFFFFF"/>
+      </w:rPr>
+      <w:tcPr>
+        <w:shd w:val="clear" w:color="auto" w:fill="712E8D"/>
+      </w:tcPr>
+    </w:tblStylePr>
+    <w:tblStylePr w:type="lastRow">
+      <w:tcPr>
+        <w:tcBorders>
+          <w:top w:val="single" w:sz="4" w:space="0" w:color="712E8D"/>
+        </w:tcBorders>
+      </w:tcPr>
+    </w:tblStylePr>
+  </w:style>
 </w:styles>
 </file>
 

</xml_diff>

<commit_message>
Ajout d'un script pour automatiser l'installation de Proxmox VE
</commit_message>
<xml_diff>
--- a/docs/Documentation_Tech_Kiformatou.docx
+++ b/docs/Documentation_Tech_Kiformatou.docx
@@ -349,7 +349,7 @@
           </w:pPr>
           <w:hyperlink w:anchor="_Toc000000037" w:history="1">
             <w:r>
-              <w:t xml:space="preserve">Création de la VM OPNsense</w:t>
+              <w:t xml:space="preserve">Création de la VM IPFire</w:t>
               <w:tab/>
               <w:t xml:space="preserve">7</w:t>
             </w:r>
@@ -364,7 +364,7 @@
           </w:pPr>
           <w:hyperlink w:anchor="_Toc000000038" w:history="1">
             <w:r>
-              <w:t xml:space="preserve">1. Créer la VM OPNsense</w:t>
+              <w:t xml:space="preserve">1. Créer la VM</w:t>
               <w:tab/>
               <w:t xml:space="preserve">7</w:t>
             </w:r>
@@ -379,7 +379,7 @@
           </w:pPr>
           <w:hyperlink w:anchor="_Toc000000029" w:history="1">
             <w:r>
-              <w:t xml:space="preserve">2. Créer un vSwitch</w:t>
+              <w:t xml:space="preserve">2. Installer la VM</w:t>
               <w:tab/>
               <w:t xml:space="preserve">8</w:t>
             </w:r>
@@ -392,11 +392,26 @@
               <w:tab w:val="right" w:leader="dot" w:pos="9514"/>
             </w:tabs>
           </w:pPr>
-          <w:hyperlink w:anchor="_Toc000000030" w:history="1">
+          <w:hyperlink w:anchor="_Toc000000039" w:history="1">
             <w:r>
-              <w:t xml:space="preserve">3. Exporter une VM vers un hôte Hyper-V</w:t>
+              <w:t xml:space="preserve">3. Configurer la VM</w:t>
               <w:tab/>
-              <w:t xml:space="preserve">8</w:t>
+              <w:t xml:space="preserve">34</w:t>
+            </w:r>
+          </w:hyperlink>
+        </w:p>
+        <w:p>
+          <w:pPr>
+            <w:pStyle w:val="TOC1"/>
+            <w:tabs>
+              <w:tab w:val="right" w:leader="dot" w:pos="9514"/>
+            </w:tabs>
+          </w:pPr>
+          <w:hyperlink w:anchor="_Toc000000040" w:history="1">
+            <w:r>
+              <w:t xml:space="preserve">Création de Proxmox VE</w:t>
+              <w:tab/>
+              <w:t xml:space="preserve">37</w:t>
             </w:r>
           </w:hyperlink>
         </w:p>
@@ -411,7 +426,7 @@
             <w:r>
               <w:t xml:space="preserve">6.  Support et références</w:t>
               <w:tab/>
-              <w:t xml:space="preserve">9</w:t>
+              <w:t xml:space="preserve">38</w:t>
             </w:r>
           </w:hyperlink>
         </w:p>
@@ -426,7 +441,7 @@
             <w:r>
               <w:t xml:space="preserve">6.1. Diagnostic et support</w:t>
               <w:tab/>
-              <w:t xml:space="preserve">9</w:t>
+              <w:t xml:space="preserve">38</w:t>
             </w:r>
           </w:hyperlink>
         </w:p>
@@ -441,7 +456,7 @@
             <w:r>
               <w:t xml:space="preserve">6.2. Glossaire</w:t>
               <w:tab/>
-              <w:t xml:space="preserve">9</w:t>
+              <w:t xml:space="preserve">38</w:t>
             </w:r>
           </w:hyperlink>
         </w:p>
@@ -456,7 +471,7 @@
             <w:r>
               <w:t xml:space="preserve">6.3. Références</w:t>
               <w:tab/>
-              <w:t xml:space="preserve">9</w:t>
+              <w:t xml:space="preserve">38</w:t>
             </w:r>
           </w:hyperlink>
           <w:r>
@@ -3927,9 +3942,11 @@
       <w:pPr>
         <w:pStyle w:val="Heading2"/>
       </w:pPr>
+      <w:bookmarkStart w:id="10" w:name="_Toc000000039"/>
       <w:r>
         <w:t xml:space="preserve">3. Configurer la VM</w:t>
       </w:r>
+      <w:bookmarkEnd w:id="10"/>
     </w:p>
     <w:p>
       <w:pPr>
@@ -4290,30 +4307,50 @@
       <w:pPr>
         <w:pStyle w:val="Heading1"/>
       </w:pPr>
-      <w:bookmarkStart w:id="10" w:name="_Toc000000021"/>
-      <w:bookmarkStart w:id="11" w:name="azure_section_21"/>
+      <w:bookmarkStart w:id="11" w:name="_Toc000000040"/>
+      <w:r>
+        <w:t xml:space="preserve">Création de Proxmox VE</w:t>
+      </w:r>
+      <w:bookmarkEnd w:id="11"/>
+    </w:p>
+    <w:p>
+      <w:pPr>
+        <w:pStyle w:val="Normal"/>
+      </w:pPr>
+    </w:p>
+    <w:p>
+      <w:pPr>
+        <w:pStyle w:val="Normal"/>
+      </w:pPr>
+    </w:p>
+    <w:p>
+      <w:pPr>
+        <w:pStyle w:val="Heading1"/>
+      </w:pPr>
+      <w:bookmarkStart w:id="12" w:name="_Toc000000021"/>
+      <w:bookmarkStart w:id="13" w:name="azure_section_21"/>
       <w:r>
         <w:t xml:space="preserve">6.  Support et références</w:t>
       </w:r>
-      <w:bookmarkEnd w:id="11"/>
-      <w:bookmarkEnd w:id="10"/>
+      <w:bookmarkEnd w:id="13"/>
+      <w:bookmarkEnd w:id="12"/>
     </w:p>
     <w:p>
       <w:pPr>
         <w:pStyle w:val="Heading2"/>
       </w:pPr>
-      <w:bookmarkStart w:id="12" w:name="_Toc000000031"/>
+      <w:bookmarkStart w:id="14" w:name="_Toc000000031"/>
       <w:r>
         <w:t xml:space="preserve">6.1. </w:t>
       </w:r>
-      <w:bookmarkStart w:id="13" w:name="_Toc000000023"/>
-      <w:bookmarkStart w:id="14" w:name="azure_section_23"/>
+      <w:bookmarkStart w:id="15" w:name="_Toc000000023"/>
+      <w:bookmarkStart w:id="16" w:name="azure_section_23"/>
       <w:r>
         <w:t xml:space="preserve">Diagnostic et support</w:t>
       </w:r>
+      <w:bookmarkEnd w:id="16"/>
+      <w:bookmarkEnd w:id="15"/>
       <w:bookmarkEnd w:id="14"/>
-      <w:bookmarkEnd w:id="13"/>
-      <w:bookmarkEnd w:id="12"/>
     </w:p>
     <w:p>
       <w:r>
@@ -4668,11 +4705,11 @@
       <w:pPr>
         <w:pStyle w:val="Heading2"/>
       </w:pPr>
-      <w:bookmarkStart w:id="15" w:name="_Toc000000032"/>
+      <w:bookmarkStart w:id="17" w:name="_Toc000000032"/>
       <w:r>
         <w:t xml:space="preserve">6.2. Glossaire</w:t>
       </w:r>
-      <w:bookmarkEnd w:id="15"/>
+      <w:bookmarkEnd w:id="17"/>
     </w:p>
     <w:p>
       <w:pPr>
@@ -4722,16 +4759,16 @@
       <w:pPr>
         <w:pStyle w:val="Heading2"/>
       </w:pPr>
-      <w:bookmarkStart w:id="16" w:name="_Toc000000033"/>
+      <w:bookmarkStart w:id="18" w:name="_Toc000000033"/>
       <w:r>
         <w:t xml:space="preserve">6.3. </w:t>
       </w:r>
-      <w:bookmarkStart w:id="17" w:name="_Toc000000024"/>
-      <w:bookmarkStart w:id="18" w:name="azure_section_24"/>
+      <w:bookmarkStart w:id="19" w:name="_Toc000000024"/>
+      <w:bookmarkStart w:id="20" w:name="azure_section_24"/>
       <w:r>
         <w:t xml:space="preserve">Références</w:t>
       </w:r>
-      <w:bookmarkEnd w:id="16"/>
+      <w:bookmarkEnd w:id="18"/>
     </w:p>
     <w:p>
       <w:pPr>

</xml_diff>